<commit_message>
Exec memo & state: track renames, timeline shift, India 24, cert guidance
- Rename tracks: Certification-Readiness Track, AI-Native Build Track
- Shift timeline 1 week: approval Jun 13, Week 1 Jun 22-26, Week 2 Jun 29-Jul 3
- India cohort expanded to 24 students (~$180K, $7,500/student)
- Certification timing coordinated with GCO and partner network counselors
  for Anthropic partner tier eligibility (not deferred indefinitely)
- Updated milestones, expansion roadmap, cumulative scale numbers

Co-Authored-By: Claude Opus 4.6 (1M context) <noreply@anthropic.com>
</commit_message>
<xml_diff>
--- a/assets/exec-memo-2026-06-04.docx
+++ b/assets/exec-memo-2026-06-04.docx
@@ -395,7 +395,7 @@
         <w:rPr>
           <w:sz w:val="22"/>
         </w:rPr>
-        <w:t>This is not a vendor partnership or reseller play. This is about ensuring that when a client has already chosen Anthropic, our team shows up as the most credible delivery partner in the room. Formal Claude Certified Architect (CCA) exams are deferred until an Anthropic partnership is established — certification counts toward partner tier levels. In the meantime, the program produces practitioners who have covered all five CCA exam domains and passed internal competency assessments.</w:t>
+        <w:t>This is not a vendor partnership or reseller play. This is about ensuring that when a client has already chosen Anthropic, our team shows up as the most credible delivery partner in the room. Formal Claude Certified Architect (CCA) exam timing will be coordinated with GCO and partner network counselors to ensure certifications count toward Anthropic partner tier eligibility. In the meantime, the program produces practitioners who have covered all five CCA exam domains and passed internal competency assessments.</w:t>
       </w:r>
     </w:p>
     <w:p>
@@ -776,7 +776,7 @@
         <w:rPr>
           <w:sz w:val="22"/>
         </w:rPr>
-        <w:t xml:space="preserve"> — The program covers all five Claude Certified Architect exam domains, positioning our team to certify when an Anthropic partnership makes it strategically valuable</w:t>
+        <w:t xml:space="preserve"> — The program covers all five Claude Certified Architect exam domains, positioning our team to certify when GCO and partner network counselors confirm timing that counts toward Anthropic partner tier eligibility</w:t>
       </w:r>
     </w:p>
     <w:p>
@@ -986,7 +986,7 @@
           </w:tcPr>
           <w:p>
             <w:r>
-              <w:t>Certification Track</w:t>
+              <w:t>Certification-Readiness Track</w:t>
             </w:r>
           </w:p>
         </w:tc>
@@ -1006,7 +1006,7 @@
           </w:tcPr>
           <w:p>
             <w:r>
-              <w:t>Internal competency assessment across all 5 domains. Formal CCA exam deferred until Anthropic partnership established.</w:t>
+              <w:t>Internal competency assessment across all 5 domains. Formal CCA exam timing coordinated with GCO and partner network counselors to ensure certifications count toward Anthropic partner tier eligibility.</w:t>
             </w:r>
           </w:p>
         </w:tc>
@@ -1018,7 +1018,7 @@
           </w:tcPr>
           <w:p>
             <w:r>
-              <w:t>Build Track</w:t>
+              <w:t>AI-Native Build Track</w:t>
             </w:r>
           </w:p>
         </w:tc>
@@ -1158,14 +1158,14 @@
         <w:rPr>
           <w:sz w:val="22"/>
         </w:rPr>
-        <w:t xml:space="preserve"> (Anthropic / certification-focused) — this portion is rebuilt per vendor for future cohorts. </w:t>
+        <w:t xml:space="preserve"> (Anthropic / certification-readiness-focused) — this portion is rebuilt per vendor for future cohorts. </w:t>
       </w:r>
       <w:r>
         <w:rPr>
           <w:b/>
           <w:sz w:val="22"/>
         </w:rPr>
-        <w:t>Week 2 is the AI Build Methodology</w:t>
+        <w:t>Week 2 is the AI-Native Build Methodology</w:t>
       </w:r>
       <w:r>
         <w:rPr>
@@ -1427,7 +1427,7 @@
         <w:rPr>
           <w:sz w:val="22"/>
         </w:rPr>
-        <w:t>#### Week 1: Anthropic Technology Deep Dive &amp; Certification (In-Person, NYC)</w:t>
+        <w:t>#### Week 1: Anthropic Technology Deep Dive &amp; Certification-Readiness (In-Person, NYC)</w:t>
       </w:r>
     </w:p>
     <w:p>
@@ -2271,7 +2271,7 @@
         <w:rPr>
           <w:sz w:val="22"/>
         </w:rPr>
-        <w:t>#### Week 2: AI Build Methodology (Virtual — Reusable Across All Vendors)</w:t>
+        <w:t>#### Week 2: AI-Native Build Methodology (Virtual — Reusable Across All Vendors)</w:t>
       </w:r>
     </w:p>
     <w:p>
@@ -3114,7 +3114,7 @@
         <w:rPr>
           <w:sz w:val="22"/>
         </w:rPr>
-        <w:t xml:space="preserve"> 12 practitioners across 6 roles cover all five CCA exam domains and pass internal competency assessments, ready to certify when partnership makes it strategically valuable</w:t>
+        <w:t xml:space="preserve"> 12 practitioners across 6 roles cover all five CCA exam domains and pass internal competency assessments, ready to certify when GCO and partner network counselors confirm timing that maximizes partner tier eligibility</w:t>
       </w:r>
     </w:p>
     <w:p>
@@ -3248,7 +3248,7 @@
           </w:tcPr>
           <w:p>
             <w:r>
-              <w:t>Approval &amp; Candidate Selection</w:t>
+              <w:t>Candidate Identification</w:t>
             </w:r>
           </w:p>
         </w:tc>
@@ -3258,7 +3258,7 @@
           </w:tcPr>
           <w:p>
             <w:r>
-              <w:t>Jun 4 – Jun 6</w:t>
+              <w:t>Jun 4 – Jun 13</w:t>
             </w:r>
           </w:p>
         </w:tc>
@@ -3268,7 +3268,7 @@
           </w:tcPr>
           <w:p>
             <w:r>
-              <w:t>Exec approval, charge codes, candidate identification, intro emails</w:t>
+              <w:t>Identify 12 candidates + alternates, intro emails, confirm interest</w:t>
             </w:r>
           </w:p>
         </w:tc>
@@ -3278,7 +3278,7 @@
           </w:tcPr>
           <w:p>
             <w:r>
-              <w:t>Verbal approval, 12 candidates invited</w:t>
+              <w:t>12 candidates confirmed</w:t>
             </w:r>
           </w:p>
         </w:tc>
@@ -3290,7 +3290,7 @@
           </w:tcPr>
           <w:p>
             <w:r>
-              <w:t>Preparation</w:t>
+              <w:t>Approval &amp; Logistics</w:t>
             </w:r>
           </w:p>
         </w:tc>
@@ -3300,7 +3300,7 @@
           </w:tcPr>
           <w:p>
             <w:r>
-              <w:t>Jun 9 – Jun 13</w:t>
+              <w:t>Jun 13 – Jun 16</w:t>
             </w:r>
           </w:p>
         </w:tc>
@@ -3310,7 +3310,7 @@
           </w:tcPr>
           <w:p>
             <w:r>
-              <w:t>Roster finalized, API provisioning, pre-work sent, travel booked, catering, curriculum finalized, facilitator dry run</w:t>
+              <w:t>Exec approval, charge codes, API provisioning, pre-work sent, travel booked</w:t>
             </w:r>
           </w:p>
         </w:tc>
@@ -3320,7 +3320,7 @@
           </w:tcPr>
           <w:p>
             <w:r>
-              <w:t>All logistics confirmed, participants prepped</w:t>
+              <w:t>Verbal approval, logistics confirmed</w:t>
             </w:r>
           </w:p>
         </w:tc>
@@ -3332,7 +3332,7 @@
           </w:tcPr>
           <w:p>
             <w:r>
-              <w:t>Week 1 (NYC, in-person)</w:t>
+              <w:t>Preparation</w:t>
             </w:r>
           </w:p>
         </w:tc>
@@ -3342,7 +3342,7 @@
           </w:tcPr>
           <w:p>
             <w:r>
-              <w:t>Jun 15 – Jun 19</w:t>
+              <w:t>Jun 16 – Jun 20</w:t>
             </w:r>
           </w:p>
         </w:tc>
@@ -3352,7 +3352,7 @@
           </w:tcPr>
           <w:p>
             <w:r>
-              <w:t>Anthropic technology deep dive, all 5 certification domains, labs, mock exams, build project kickoff</w:t>
+              <w:t>Roster finalized, catering, curriculum finalized, facilitator dry run</w:t>
             </w:r>
           </w:p>
         </w:tc>
@@ -3362,7 +3362,7 @@
           </w:tcPr>
           <w:p>
             <w:r>
-              <w:t>5 exam domains covered, teams formed</w:t>
+              <w:t>All logistics confirmed, participants prepped</w:t>
             </w:r>
           </w:p>
         </w:tc>
@@ -3374,7 +3374,7 @@
           </w:tcPr>
           <w:p>
             <w:r>
-              <w:t>Week 2 (virtual)</w:t>
+              <w:t>Week 1 (NYC, in-person)</w:t>
             </w:r>
           </w:p>
         </w:tc>
@@ -3394,7 +3394,7 @@
           </w:tcPr>
           <w:p>
             <w:r>
-              <w:t>AI Build Methodology, 4 build sprints, team demos to leadership</w:t>
+              <w:t>Anthropic technology deep dive, all 5 certification-readiness domains, labs, mock exams, build project kickoff</w:t>
             </w:r>
           </w:p>
         </w:tc>
@@ -3404,7 +3404,7 @@
           </w:tcPr>
           <w:p>
             <w:r>
-              <w:t>Cohort complete, 2-3 trainers identified</w:t>
+              <w:t>5 exam domains covered, teams formed</w:t>
             </w:r>
           </w:p>
         </w:tc>
@@ -3416,7 +3416,7 @@
           </w:tcPr>
           <w:p>
             <w:r>
-              <w:t>Competency Assessment</w:t>
+              <w:t>Week 2 (virtual)</w:t>
             </w:r>
           </w:p>
         </w:tc>
@@ -3426,7 +3426,7 @@
           </w:tcPr>
           <w:p>
             <w:r>
-              <w:t>Jun 27</w:t>
+              <w:t>Jun 29 – Jul 3</w:t>
             </w:r>
           </w:p>
         </w:tc>
@@ -3436,7 +3436,7 @@
           </w:tcPr>
           <w:p>
             <w:r>
-              <w:t>Internal skills assessment across all 5 CCA domains distributed</w:t>
+              <w:t>AI-Native Build Methodology, 4 build sprints, team demos to leadership</w:t>
             </w:r>
           </w:p>
         </w:tc>
@@ -3446,7 +3446,7 @@
           </w:tcPr>
           <w:p>
             <w:r>
-              <w:t>12 certification-ready practitioners</w:t>
+              <w:t>Cohort complete, 2-3 trainers identified</w:t>
             </w:r>
           </w:p>
         </w:tc>
@@ -3458,6 +3458,90 @@
           </w:tcPr>
           <w:p>
             <w:r>
+              <w:t>Competency Assessment</w:t>
+            </w:r>
+          </w:p>
+        </w:tc>
+        <w:tc>
+          <w:tcPr>
+            <w:tcW w:type="dxa" w:w="2160"/>
+          </w:tcPr>
+          <w:p>
+            <w:r>
+              <w:t>Jul 7</w:t>
+            </w:r>
+          </w:p>
+        </w:tc>
+        <w:tc>
+          <w:tcPr>
+            <w:tcW w:type="dxa" w:w="2160"/>
+          </w:tcPr>
+          <w:p>
+            <w:r>
+              <w:t>Internal skills assessment across all 5 CCA domains distributed</w:t>
+            </w:r>
+          </w:p>
+        </w:tc>
+        <w:tc>
+          <w:tcPr>
+            <w:tcW w:type="dxa" w:w="2160"/>
+          </w:tcPr>
+          <w:p>
+            <w:r>
+              <w:t>12 certification-ready practitioners</w:t>
+            </w:r>
+          </w:p>
+        </w:tc>
+      </w:tr>
+      <w:tr>
+        <w:tc>
+          <w:tcPr>
+            <w:tcW w:type="dxa" w:w="2160"/>
+          </w:tcPr>
+          <w:p>
+            <w:r>
+              <w:t>Certification Decision</w:t>
+            </w:r>
+          </w:p>
+        </w:tc>
+        <w:tc>
+          <w:tcPr>
+            <w:tcW w:type="dxa" w:w="2160"/>
+          </w:tcPr>
+          <w:p>
+            <w:r>
+              <w:t>TBD</w:t>
+            </w:r>
+          </w:p>
+        </w:tc>
+        <w:tc>
+          <w:tcPr>
+            <w:tcW w:type="dxa" w:w="2160"/>
+          </w:tcPr>
+          <w:p>
+            <w:r>
+              <w:t>Coordinate with GCO and partner network counselors on CCA exam timing to ensure certifications count toward Anthropic partner tier eligibility</w:t>
+            </w:r>
+          </w:p>
+        </w:tc>
+        <w:tc>
+          <w:tcPr>
+            <w:tcW w:type="dxa" w:w="2160"/>
+          </w:tcPr>
+          <w:p>
+            <w:r>
+              <w:t>Certification pathway confirmed</w:t>
+            </w:r>
+          </w:p>
+        </w:tc>
+      </w:tr>
+      <w:tr>
+        <w:tc>
+          <w:tcPr>
+            <w:tcW w:type="dxa" w:w="2160"/>
+          </w:tcPr>
+          <w:p>
+            <w:r>
               <w:t>Retrospective &amp; India decision</w:t>
             </w:r>
           </w:p>
@@ -3468,7 +3552,7 @@
           </w:tcPr>
           <w:p>
             <w:r>
-              <w:t>Jul 14</w:t>
+              <w:t>Jul 21</w:t>
             </w:r>
           </w:p>
         </w:tc>
@@ -4456,33 +4540,46 @@
         <w:rPr>
           <w:sz w:val="22"/>
         </w:rPr>
-        <w:t xml:space="preserve">Pending successful completion of the US cohort, an India cohort (Bangalore, 2 weeks, 12 students) is estimated at approximately </w:t>
+        <w:t xml:space="preserve">Pending successful completion of the US cohort, an India cohort (Bangalore, 2 weeks, </w:t>
       </w:r>
       <w:r>
         <w:rPr>
           <w:b/>
           <w:sz w:val="22"/>
         </w:rPr>
-        <w:t>$141,000</w:t>
+        <w:t>24 students</w:t>
       </w:r>
       <w:r>
         <w:rPr>
           <w:sz w:val="22"/>
         </w:rPr>
-        <w:t xml:space="preserve">, including US co-facilitator travel (business class). This would bring the combined program to approximately </w:t>
+        <w:t xml:space="preserve">) is estimated at approximately </w:t>
       </w:r>
       <w:r>
         <w:rPr>
           <w:b/>
           <w:sz w:val="22"/>
         </w:rPr>
-        <w:t>$430,000</w:t>
+        <w:t>$180,000</w:t>
       </w:r>
       <w:r>
         <w:rPr>
           <w:sz w:val="22"/>
         </w:rPr>
-        <w:t xml:space="preserve"> and produce 24 certification-ready practitioners across 2 geographies.</w:t>
+        <w:t xml:space="preserve">, including US co-facilitator travel (business class). The larger cohort size drives the per-student cost down significantly ($7,500/student vs $24,200/student for the US cohort). This would bring the combined program to approximately </w:t>
+      </w:r>
+      <w:r>
+        <w:rPr>
+          <w:b/>
+          <w:sz w:val="22"/>
+        </w:rPr>
+        <w:t>$470,000</w:t>
+      </w:r>
+      <w:r>
+        <w:rPr>
+          <w:sz w:val="22"/>
+        </w:rPr>
+        <w:t xml:space="preserve"> and produce 36 certification-ready practitioners across 2 geographies.</w:t>
       </w:r>
     </w:p>
     <w:p>
@@ -4621,7 +4718,7 @@
         <w:rPr>
           <w:sz w:val="22"/>
         </w:rPr>
-        <w:t xml:space="preserve"> When a client asks "Have your people actually built with Claude?", the answer is yes — with internal competency assessments and project artifacts to show, and certification-readiness that converts to formal credentials when an Anthropic partnership is established</w:t>
+        <w:t xml:space="preserve"> When a client asks "Have your people actually built with Claude?", the answer is yes — with internal competency assessments and project artifacts to show, and certification-readiness that converts to formal credentials once GCO and partner network counselors confirm timing for partner tier eligibility</w:t>
       </w:r>
     </w:p>
     <w:p>
@@ -4736,7 +4833,7 @@
           </w:tcPr>
           <w:p>
             <w:r>
-              <w:t>Participants cannot be freed from client work for 2 weeks (Jun 15-26)</w:t>
+              <w:t>Participants cannot be freed from client work for 2 weeks (Jun 22 – Jul 3)</w:t>
             </w:r>
           </w:p>
         </w:tc>
@@ -4766,7 +4863,7 @@
           </w:tcPr>
           <w:p>
             <w:r>
-              <w:t>Secure executive sponsor commitment by Jun 5; target practitioners between engagements or on bench; candidates confirm by Jun 9</w:t>
+              <w:t>Secure executive sponsor commitment by Jun 13; target practitioners between engagements or on bench; candidates confirm by Jun 16</w:t>
             </w:r>
           </w:p>
         </w:tc>
@@ -5163,13 +5260,13 @@
           <w:b/>
           <w:sz w:val="22"/>
         </w:rPr>
-        <w:t>Decision by June 5, 2026</w:t>
+        <w:t>Decision by June 13, 2026</w:t>
       </w:r>
       <w:r>
         <w:rPr>
           <w:sz w:val="22"/>
         </w:rPr>
-        <w:t xml:space="preserve"> to maintain the program timeline — Week 1 starts June 15</w:t>
+        <w:t xml:space="preserve"> to maintain the program timeline — Week 1 starts June 22</w:t>
       </w:r>
     </w:p>
     <w:p>
@@ -5177,7 +5274,7 @@
         <w:rPr>
           <w:sz w:val="22"/>
         </w:rPr>
-        <w:t>The people's time investment is recouped through accelerated client delivery capability and the elimination of ongoing training program costs via the train-the-trainer model. A successful US cohort positions us to expand to India (~$141K additional) and ultimately build a global bench of 24+ certification-ready practitioners.</w:t>
+        <w:t>The people's time investment is recouped through accelerated client delivery capability and the elimination of ongoing training program costs via the train-the-trainer model. A successful US cohort positions us to expand to India (~$180K for 24 students) and ultimately build a global bench of 36+ certification-ready practitioners.</w:t>
       </w:r>
     </w:p>
     <w:p>
@@ -5276,7 +5373,20 @@
         <w:rPr>
           <w:sz w:val="22"/>
         </w:rPr>
-        <w:t>GDS India cohort (Bangalore, 12 students) — Phase 1 graduates co-facilitate</w:t>
+        <w:t xml:space="preserve">GDS India cohort (Bangalore, </w:t>
+      </w:r>
+      <w:r>
+        <w:rPr>
+          <w:b/>
+          <w:sz w:val="22"/>
+        </w:rPr>
+        <w:t>24 students</w:t>
+      </w:r>
+      <w:r>
+        <w:rPr>
+          <w:sz w:val="22"/>
+        </w:rPr>
+        <w:t>) — Phase 1 graduates co-facilitate; larger cohort drives per-student cost down significantly</w:t>
       </w:r>
     </w:p>
     <w:p>
@@ -5287,7 +5397,7 @@
         <w:rPr>
           <w:sz w:val="22"/>
         </w:rPr>
-        <w:t>1 additional US cohort (second city) — Phase 1 graduates facilitate independently</w:t>
+        <w:t>1 additional US cohort (second city, 12 students) — Phase 1 graduates facilitate independently</w:t>
       </w:r>
     </w:p>
     <w:p>
@@ -5298,7 +5408,7 @@
         <w:rPr>
           <w:sz w:val="22"/>
         </w:rPr>
-        <w:t>~24 additional certification-ready Anthropic practitioners</w:t>
+        <w:t>~36 additional certification-ready Anthropic practitioners</w:t>
       </w:r>
     </w:p>
     <w:p>
@@ -5309,7 +5419,7 @@
         <w:rPr>
           <w:sz w:val="22"/>
         </w:rPr>
-        <w:t>India cohorts significantly cheaper ($45/hr student rate vs $200/hr)</w:t>
+        <w:t>India cohorts significantly cheaper ($45/hr student rate vs $200/hr; 24-student cohort at ~$7,500/student)</w:t>
       </w:r>
     </w:p>
     <w:p>
@@ -5326,12 +5436,13 @@
           <w:b/>
           <w:sz w:val="22"/>
         </w:rPr>
-        <w:t>~$280K estimated</w:t>
+        <w:t>~$470K estimated</w:t>
       </w:r>
       <w:r>
         <w:rPr>
           <w:sz w:val="22"/>
         </w:rPr>
+        <w:t xml:space="preserve"> (US $290K + India $180K)</w:t>
       </w:r>
     </w:p>
     <w:p>
@@ -5384,7 +5495,7 @@
         <w:rPr>
           <w:sz w:val="22"/>
         </w:rPr>
-        <w:t>Only Week 1 needs design per vendor; Week 2 (AI Build Methodology) reused as-is</w:t>
+        <w:t>Only Week 1 needs design per vendor; Week 2 (AI-Native Build Methodology) reused as-is</w:t>
       </w:r>
     </w:p>
     <w:p>
@@ -5575,7 +5686,7 @@
           <w:b/>
           <w:sz w:val="22"/>
         </w:rPr>
-        <w:t>Week 2 (AI Build Methodology) is vendor-agnostic</w:t>
+        <w:t>Week 2 (AI-Native Build Methodology) is vendor-agnostic</w:t>
       </w:r>
       <w:r>
         <w:rPr>
@@ -5962,7 +6073,7 @@
         <w:rPr>
           <w:sz w:val="22"/>
         </w:rPr>
-        <w:t>The train-the-trainer model compounds across technologies: a facilitator who has run the Anthropic cohort can run the AWS cohort with only Week 1 retraining, because Week 2 methodology skills transfer directly.</w:t>
+        <w:t>The train-the-trainer model compounds across technologies: a facilitator who has run the Anthropic cohort can run the AWS cohort with only Week 1 retraining, because the AI-Native Build Methodology skills transfer directly.</w:t>
       </w:r>
     </w:p>
     <w:p>
@@ -6082,7 +6193,7 @@
           </w:tcPr>
           <w:p>
             <w:r>
-              <w:t>~$141K per cohort (lower labor rates, higher travel)</w:t>
+              <w:t>~$180K per cohort (24 students, lower labor rates, higher travel)</w:t>
             </w:r>
           </w:p>
         </w:tc>
@@ -6383,7 +6494,7 @@
           </w:tcPr>
           <w:p>
             <w:r>
-              <w:t>36</w:t>
+              <w:t>48</w:t>
             </w:r>
           </w:p>
         </w:tc>
@@ -6455,7 +6566,7 @@
           </w:tcPr>
           <w:p>
             <w:r>
-              <w:t>72+</w:t>
+              <w:t>96+</w:t>
             </w:r>
           </w:p>
         </w:tc>
@@ -6527,7 +6638,7 @@
           </w:tcPr>
           <w:p>
             <w:r>
-              <w:t>150+</w:t>
+              <w:t>200+</w:t>
             </w:r>
           </w:p>
         </w:tc>

</xml_diff>

<commit_message>
Rewrite expansion roadmap: 1K US + 5K GDS across 10+ vendors
Scale target: ~1,000 US practitioners by Q3 2027, ~5,000 GDS (India +
Mexico) by Q2 2028. Vendor priority: Tier 1 (Anthropic, OpenAI/Codex),
Tier 2 (AWS/Bedrock, Palantir), Tier 3 (GCP/Gemini, NVIDIA), Tier 4
(IBM, Cohere, Perplexity, LangChain, Mistral, LangGraph, LlamaIndex).

Quarter-by-quarter ramp table shows trainer compounding math. GDS
cohorts at 36 students (~$5-7.5K/student) for 3x scale per dollar.

Co-Authored-By: Claude Opus 4.6 (1M context) <noreply@anthropic.com>
</commit_message>
<xml_diff>
--- a/assets/exec-memo-2026-06-04.docx
+++ b/assets/exec-memo-2026-06-04.docx
@@ -5274,7 +5274,33 @@
         <w:rPr>
           <w:sz w:val="22"/>
         </w:rPr>
-        <w:t>The people's time investment is recouped through accelerated client delivery capability and the elimination of ongoing training program costs via the train-the-trainer model. A successful US cohort positions us to expand to India (~$180K for 24 students) and ultimately build a global bench of 36+ certification-ready practitioners.</w:t>
+        <w:t xml:space="preserve">The people's time investment is recouped through accelerated client delivery capability and the elimination of ongoing training program costs via the train-the-trainer model. This first cohort is the seed for a program that scales to </w:t>
+      </w:r>
+      <w:r>
+        <w:rPr>
+          <w:b/>
+          <w:sz w:val="22"/>
+        </w:rPr>
+        <w:t>~1,000 US practitioners</w:t>
+      </w:r>
+      <w:r>
+        <w:rPr>
+          <w:sz w:val="22"/>
+        </w:rPr>
+        <w:t xml:space="preserve"> and </w:t>
+      </w:r>
+      <w:r>
+        <w:rPr>
+          <w:b/>
+          <w:sz w:val="22"/>
+        </w:rPr>
+        <w:t>~5,000 GDS practitioners</w:t>
+      </w:r>
+      <w:r>
+        <w:rPr>
+          <w:sz w:val="22"/>
+        </w:rPr>
+        <w:t xml:space="preserve"> across 10+ technology platforms within one year.</w:t>
       </w:r>
     </w:p>
     <w:p>
@@ -5290,7 +5316,26 @@
         <w:rPr>
           <w:sz w:val="22"/>
         </w:rPr>
-        <w:t>This budget approval funds the full roadmap below. Phases 2-4 do not require additional executive approval — the plan is ours to execute once funded, with phasing driven by client demand and trainer availability.</w:t>
+      </w:r>
+      <w:r>
+        <w:rPr>
+          <w:b/>
+          <w:sz w:val="22"/>
+        </w:rPr>
+        <w:t>Target: ~1,000 US practitioners + ~5,000 GDS practitioners across 10+ technology platforms within one year.</w:t>
+      </w:r>
+      <w:r>
+        <w:rPr>
+          <w:sz w:val="22"/>
+        </w:rPr>
+      </w:r>
+    </w:p>
+    <w:p>
+      <w:r>
+        <w:rPr>
+          <w:sz w:val="22"/>
+        </w:rPr>
+        <w:t>This budget approval seeds the entire program. The train-the-trainer model is the growth engine: each cohort produces 2-3 new facilitators who run subsequent cohorts, creating exponential capacity. The AI-Native Build Methodology (Week 2) is reused across all vendors — only Week 1 is rebuilt per technology.</w:t>
       </w:r>
     </w:p>
     <w:p>
@@ -5298,433 +5343,23 @@
         <w:pStyle w:val="Heading3"/>
       </w:pPr>
       <w:r>
-        <w:t>Phase 1: Prove the Model (Q3 2026)</w:t>
+        <w:t>Vendor Priority</w:t>
       </w:r>
     </w:p>
     <w:p>
-      <w:pPr>
-        <w:pStyle w:val="ListBullet"/>
-      </w:pPr>
-      <w:r>
-        <w:rPr>
-          <w:sz w:val="22"/>
-        </w:rPr>
-        <w:t>1 US cohort (Anthropic), 12 students, NYC</w:t>
+      <w:r>
+        <w:rPr>
+          <w:sz w:val="22"/>
+        </w:rPr>
+        <w:t>Vendors are sequenced by client demand and strategic value:</w:t>
       </w:r>
     </w:p>
     <w:p>
-      <w:pPr>
-        <w:pStyle w:val="ListBullet"/>
-      </w:pPr>
-      <w:r>
-        <w:rPr>
-          <w:sz w:val="22"/>
-        </w:rPr>
-        <w:t>Produce 12 certification-ready Claude practitioners + 2-3 internal trainers</w:t>
-      </w:r>
-    </w:p>
-    <w:p>
-      <w:pPr>
-        <w:pStyle w:val="ListBullet"/>
-      </w:pPr>
-      <w:r>
-        <w:rPr>
-          <w:sz w:val="22"/>
-        </w:rPr>
-        <w:t>Output: proven curriculum, playbooks, facilitator guides, AI build methodology</w:t>
-      </w:r>
-    </w:p>
-    <w:p>
-      <w:pPr>
-        <w:pStyle w:val="ListBullet"/>
-      </w:pPr>
-      <w:r>
-        <w:rPr>
-          <w:sz w:val="22"/>
-        </w:rPr>
-      </w:r>
-      <w:r>
-        <w:rPr>
-          <w:b/>
-          <w:sz w:val="22"/>
-        </w:rPr>
-        <w:t>$290,525</w:t>
-      </w:r>
-      <w:r>
-        <w:rPr>
-          <w:sz w:val="22"/>
-        </w:rPr>
-        <w:t xml:space="preserve"> (this ask)</w:t>
-      </w:r>
-    </w:p>
-    <w:p>
-      <w:pPr>
-        <w:pStyle w:val="Heading3"/>
-      </w:pPr>
-      <w:r>
-        <w:t>Phase 2: Scale Geographically — Anthropic (Q4 2026)</w:t>
-      </w:r>
-    </w:p>
-    <w:p>
-      <w:pPr>
-        <w:pStyle w:val="ListBullet"/>
-      </w:pPr>
-      <w:r>
-        <w:rPr>
-          <w:sz w:val="22"/>
-        </w:rPr>
-        <w:t xml:space="preserve">GDS India cohort (Bangalore, </w:t>
-      </w:r>
-      <w:r>
-        <w:rPr>
-          <w:b/>
-          <w:sz w:val="22"/>
-        </w:rPr>
-        <w:t>24 students</w:t>
-      </w:r>
-      <w:r>
-        <w:rPr>
-          <w:sz w:val="22"/>
-        </w:rPr>
-        <w:t>) — Phase 1 graduates co-facilitate; larger cohort drives per-student cost down significantly</w:t>
-      </w:r>
-    </w:p>
-    <w:p>
-      <w:pPr>
-        <w:pStyle w:val="ListBullet"/>
-      </w:pPr>
-      <w:r>
-        <w:rPr>
-          <w:sz w:val="22"/>
-        </w:rPr>
-        <w:t>1 additional US cohort (second city, 12 students) — Phase 1 graduates facilitate independently</w:t>
-      </w:r>
-    </w:p>
-    <w:p>
-      <w:pPr>
-        <w:pStyle w:val="ListBullet"/>
-      </w:pPr>
-      <w:r>
-        <w:rPr>
-          <w:sz w:val="22"/>
-        </w:rPr>
-        <w:t>~36 additional certification-ready Anthropic practitioners</w:t>
-      </w:r>
-    </w:p>
-    <w:p>
-      <w:pPr>
-        <w:pStyle w:val="ListBullet"/>
-      </w:pPr>
-      <w:r>
-        <w:rPr>
-          <w:sz w:val="22"/>
-        </w:rPr>
-        <w:t>India cohorts significantly cheaper ($45/hr student rate vs $200/hr; 24-student cohort at ~$7,500/student)</w:t>
-      </w:r>
-    </w:p>
-    <w:p>
-      <w:pPr>
-        <w:pStyle w:val="ListBullet"/>
-      </w:pPr>
-      <w:r>
-        <w:rPr>
-          <w:sz w:val="22"/>
-        </w:rPr>
-      </w:r>
-      <w:r>
-        <w:rPr>
-          <w:b/>
-          <w:sz w:val="22"/>
-        </w:rPr>
-        <w:t>~$470K estimated</w:t>
-      </w:r>
-      <w:r>
-        <w:rPr>
-          <w:sz w:val="22"/>
-        </w:rPr>
-        <w:t xml:space="preserve"> (US $290K + India $180K)</w:t>
-      </w:r>
-    </w:p>
-    <w:p>
-      <w:pPr>
-        <w:pStyle w:val="Heading3"/>
-      </w:pPr>
-      <w:r>
-        <w:t>Phase 3: Multi-Vendor Expansion (Q1-Q2 2027)</w:t>
-      </w:r>
-    </w:p>
-    <w:p>
-      <w:pPr>
-        <w:pStyle w:val="ListBullet"/>
-      </w:pPr>
-      <w:r>
-        <w:rPr>
-          <w:sz w:val="22"/>
-        </w:rPr>
-        <w:t>GDS Mexico cohort (Anthropic — nearshore bench)</w:t>
-      </w:r>
-    </w:p>
-    <w:p>
-      <w:pPr>
-        <w:pStyle w:val="ListBullet"/>
-      </w:pPr>
-      <w:r>
-        <w:rPr>
-          <w:sz w:val="22"/>
-        </w:rPr>
-        <w:t xml:space="preserve">Launch new vendor Week 1 tracks: </w:t>
-      </w:r>
-      <w:r>
-        <w:rPr>
-          <w:b/>
-          <w:sz w:val="22"/>
-        </w:rPr>
-        <w:t>NVIDIA, AWS, GCP</w:t>
-      </w:r>
-      <w:r>
-        <w:rPr>
-          <w:sz w:val="22"/>
-        </w:rPr>
-      </w:r>
-    </w:p>
-    <w:p>
-      <w:pPr>
-        <w:pStyle w:val="ListBullet"/>
-      </w:pPr>
-      <w:r>
-        <w:rPr>
-          <w:sz w:val="22"/>
-        </w:rPr>
-        <w:t>Only Week 1 needs design per vendor; Week 2 (AI-Native Build Methodology) reused as-is</w:t>
-      </w:r>
-    </w:p>
-    <w:p>
-      <w:pPr>
-        <w:pStyle w:val="ListBullet"/>
-      </w:pPr>
-      <w:r>
-        <w:rPr>
-          <w:sz w:val="22"/>
-        </w:rPr>
-        <w:t>~36+ additional certification-ready practitioners across 4 technologies</w:t>
-      </w:r>
-    </w:p>
-    <w:p>
-      <w:pPr>
-        <w:pStyle w:val="ListBullet"/>
-      </w:pPr>
-      <w:r>
-        <w:rPr>
-          <w:sz w:val="22"/>
-        </w:rPr>
-      </w:r>
-      <w:r>
-        <w:rPr>
-          <w:b/>
-          <w:sz w:val="22"/>
-        </w:rPr>
-        <w:t>~$400-500K estimated</w:t>
-      </w:r>
-      <w:r>
-        <w:rPr>
-          <w:sz w:val="22"/>
-        </w:rPr>
-        <w:t xml:space="preserve"> (multiple cohorts, decreasing unit cost per cohort)</w:t>
-      </w:r>
-    </w:p>
-    <w:p>
-      <w:pPr>
-        <w:pStyle w:val="Heading3"/>
-      </w:pPr>
-      <w:r>
-        <w:t>Phase 4: Full Portfolio (Q3 2027+)</w:t>
-      </w:r>
-    </w:p>
-    <w:p>
-      <w:pPr>
-        <w:pStyle w:val="ListBullet"/>
-      </w:pPr>
-      <w:r>
-        <w:rPr>
-          <w:sz w:val="22"/>
-        </w:rPr>
-        <w:t xml:space="preserve">Add </w:t>
-      </w:r>
-      <w:r>
-        <w:rPr>
-          <w:b/>
-          <w:sz w:val="22"/>
-        </w:rPr>
-        <w:t>OpenAI, IBM, Palantir, Databricks</w:t>
-      </w:r>
-      <w:r>
-        <w:rPr>
-          <w:sz w:val="22"/>
-        </w:rPr>
-        <w:t>, and others as client demand dictates</w:t>
-      </w:r>
-    </w:p>
-    <w:p>
-      <w:pPr>
-        <w:pStyle w:val="ListBullet"/>
-      </w:pPr>
-      <w:r>
-        <w:rPr>
-          <w:sz w:val="22"/>
-        </w:rPr>
-        <w:t>Running across all geographies (US multi-city, GDS India, GDS Mexico)</w:t>
-      </w:r>
-    </w:p>
-    <w:p>
-      <w:pPr>
-        <w:pStyle w:val="ListBullet"/>
-      </w:pPr>
-      <w:r>
-        <w:rPr>
-          <w:sz w:val="22"/>
-        </w:rPr>
-        <w:t>150+ total certification-ready practitioners across 8+ technology platforms</w:t>
-      </w:r>
-    </w:p>
-    <w:p>
-      <w:pPr>
-        <w:pStyle w:val="ListBullet"/>
-      </w:pPr>
-      <w:r>
-        <w:rPr>
-          <w:sz w:val="22"/>
-        </w:rPr>
-        <w:t>Fully self-sustaining — trainer pool runs without central program team</w:t>
-      </w:r>
-    </w:p>
-    <w:p>
-      <w:pPr>
-        <w:pStyle w:val="ListBullet"/>
-      </w:pPr>
-      <w:r>
-        <w:rPr>
-          <w:sz w:val="22"/>
-        </w:rPr>
-      </w:r>
-      <w:r>
-        <w:rPr>
-          <w:b/>
-          <w:sz w:val="22"/>
-        </w:rPr>
-        <w:t>Unit cost drops to ~$50-80K per cohort</w:t>
-      </w:r>
-      <w:r>
-        <w:rPr>
-          <w:sz w:val="22"/>
-        </w:rPr>
-        <w:t xml:space="preserve"> (no methodology design, internal facilitators, GDS cost rates)</w:t>
-      </w:r>
-    </w:p>
-    <w:p>
-      <w:pPr>
-        <w:pStyle w:val="Heading3"/>
-      </w:pPr>
-      <w:r>
-        <w:t>Technology Portfolio</w:t>
-      </w:r>
-    </w:p>
-    <w:p>
-      <w:r>
-        <w:rPr>
-          <w:sz w:val="22"/>
-        </w:rPr>
-        <w:t xml:space="preserve">The program is architected for multi-vendor reuse. This is a critical strategic advantage: we are not building an Anthropic training program — we are building a </w:t>
-      </w:r>
-      <w:r>
-        <w:rPr>
-          <w:b/>
-          <w:sz w:val="22"/>
-        </w:rPr>
-        <w:t>technology enablement engine</w:t>
-      </w:r>
-      <w:r>
-        <w:rPr>
-          <w:sz w:val="22"/>
-        </w:rPr>
-        <w:t xml:space="preserve"> that works across any AI platform.</w:t>
-      </w:r>
-    </w:p>
-    <w:p>
-      <w:pPr>
-        <w:pStyle w:val="ListBullet"/>
-      </w:pPr>
-      <w:r>
-        <w:rPr>
-          <w:sz w:val="22"/>
-        </w:rPr>
-      </w:r>
-      <w:r>
-        <w:rPr>
-          <w:b/>
-          <w:sz w:val="22"/>
-        </w:rPr>
-        <w:t>Week 1 is vendor-specific</w:t>
-      </w:r>
-      <w:r>
-        <w:rPr>
-          <w:sz w:val="22"/>
-        </w:rPr>
-        <w:t xml:space="preserve"> — rebuilt per technology to cover that vendor's products, APIs, architecture patterns, and certification domains</w:t>
-      </w:r>
-    </w:p>
-    <w:p>
-      <w:pPr>
-        <w:pStyle w:val="ListBullet"/>
-      </w:pPr>
-      <w:r>
-        <w:rPr>
-          <w:sz w:val="22"/>
-        </w:rPr>
-      </w:r>
-      <w:r>
-        <w:rPr>
-          <w:b/>
-          <w:sz w:val="22"/>
-        </w:rPr>
-        <w:t>Week 2 (AI-Native Build Methodology) is vendor-agnostic</w:t>
-      </w:r>
-      <w:r>
-        <w:rPr>
-          <w:sz w:val="22"/>
-        </w:rPr>
-        <w:t xml:space="preserve"> — reusable as-is across all technologies. Specs, harnesses, collaboration patterns, testing, deployment, and communications apply regardless of the underlying AI platform</w:t>
-      </w:r>
-    </w:p>
-    <w:p>
-      <w:pPr>
-        <w:pStyle w:val="ListBullet"/>
-      </w:pPr>
-      <w:r>
-        <w:rPr>
-          <w:sz w:val="22"/>
-        </w:rPr>
-        <w:t xml:space="preserve">Each new vendor program requires approximately </w:t>
-      </w:r>
-      <w:r>
-        <w:rPr>
-          <w:b/>
-          <w:sz w:val="22"/>
-        </w:rPr>
-        <w:t>half the design effort</w:t>
-      </w:r>
-      <w:r>
-        <w:rPr>
-          <w:sz w:val="22"/>
-        </w:rPr>
-        <w:t xml:space="preserve"> of this initial investment</w:t>
-      </w:r>
-    </w:p>
-    <w:p>
-      <w:r>
-        <w:rPr>
-          <w:sz w:val="22"/>
-        </w:rPr>
-        <w:t>|--------|-------------|---------------|</w:t>
+      <w:r>
+        <w:rPr>
+          <w:sz w:val="22"/>
+        </w:rPr>
+        <w:t>|----------|--------|-------------|---------------|</w:t>
       </w:r>
     </w:p>
     <w:tbl>
@@ -5734,14 +5369,28 @@
         <w:tblLook w:firstColumn="1" w:firstRow="1" w:lastColumn="0" w:lastRow="0" w:noHBand="0" w:noVBand="1" w:val="04A0"/>
       </w:tblPr>
       <w:tblGrid>
-        <w:gridCol w:w="2880"/>
-        <w:gridCol w:w="2880"/>
-        <w:gridCol w:w="2880"/>
+        <w:gridCol w:w="2160"/>
+        <w:gridCol w:w="2160"/>
+        <w:gridCol w:w="2160"/>
+        <w:gridCol w:w="2160"/>
       </w:tblGrid>
       <w:tr>
         <w:tc>
           <w:tcPr>
-            <w:tcW w:type="dxa" w:w="2880"/>
+            <w:tcW w:type="dxa" w:w="2160"/>
+          </w:tcPr>
+          <w:p>
+            <w:r>
+              <w:rPr>
+                <w:b/>
+              </w:rPr>
+              <w:t>Priority</w:t>
+            </w:r>
+          </w:p>
+        </w:tc>
+        <w:tc>
+          <w:tcPr>
+            <w:tcW w:type="dxa" w:w="2160"/>
           </w:tcPr>
           <w:p>
             <w:r>
@@ -5754,7 +5403,7 @@
         </w:tc>
         <w:tc>
           <w:tcPr>
-            <w:tcW w:type="dxa" w:w="2880"/>
+            <w:tcW w:type="dxa" w:w="2160"/>
           </w:tcPr>
           <w:p>
             <w:r>
@@ -5767,7 +5416,7 @@
         </w:tc>
         <w:tc>
           <w:tcPr>
-            <w:tcW w:type="dxa" w:w="2880"/>
+            <w:tcW w:type="dxa" w:w="2160"/>
           </w:tcPr>
           <w:p>
             <w:r>
@@ -5782,17 +5431,27 @@
       <w:tr>
         <w:tc>
           <w:tcPr>
-            <w:tcW w:type="dxa" w:w="2880"/>
-          </w:tcPr>
-          <w:p>
-            <w:r>
-              <w:t>**Anthropic** (this cohort)</w:t>
-            </w:r>
-          </w:p>
-        </w:tc>
-        <w:tc>
-          <w:tcPr>
-            <w:tcW w:type="dxa" w:w="2880"/>
+            <w:tcW w:type="dxa" w:w="2160"/>
+          </w:tcPr>
+          <w:p>
+            <w:r>
+              <w:t>**Tier 1**</w:t>
+            </w:r>
+          </w:p>
+        </w:tc>
+        <w:tc>
+          <w:tcPr>
+            <w:tcW w:type="dxa" w:w="2160"/>
+          </w:tcPr>
+          <w:p>
+            <w:r>
+              <w:t>**Anthropic / Claude**</w:t>
+            </w:r>
+          </w:p>
+        </w:tc>
+        <w:tc>
+          <w:tcPr>
+            <w:tcW w:type="dxa" w:w="2160"/>
           </w:tcPr>
           <w:p>
             <w:r>
@@ -5802,7 +5461,7 @@
         </w:tc>
         <w:tc>
           <w:tcPr>
-            <w:tcW w:type="dxa" w:w="2880"/>
+            <w:tcW w:type="dxa" w:w="2160"/>
           </w:tcPr>
           <w:p>
             <w:r>
@@ -5814,31 +5473,41 @@
       <w:tr>
         <w:tc>
           <w:tcPr>
-            <w:tcW w:type="dxa" w:w="2880"/>
-          </w:tcPr>
-          <w:p>
-            <w:r>
-              <w:t>**NVIDIA**</w:t>
-            </w:r>
-          </w:p>
-        </w:tc>
-        <w:tc>
-          <w:tcPr>
-            <w:tcW w:type="dxa" w:w="2880"/>
-          </w:tcPr>
-          <w:p>
-            <w:r>
-              <w:t>NIM microservices, GPU infrastructure, inference optimization, CUDA</w:t>
-            </w:r>
-          </w:p>
-        </w:tc>
-        <w:tc>
-          <w:tcPr>
-            <w:tcW w:type="dxa" w:w="2880"/>
-          </w:tcPr>
-          <w:p>
-            <w:r>
-              <w:t>NVIDIA Certified AI Solutions Architect</w:t>
+            <w:tcW w:type="dxa" w:w="2160"/>
+          </w:tcPr>
+          <w:p>
+            <w:r>
+              <w:t>**Tier 1**</w:t>
+            </w:r>
+          </w:p>
+        </w:tc>
+        <w:tc>
+          <w:tcPr>
+            <w:tcW w:type="dxa" w:w="2160"/>
+          </w:tcPr>
+          <w:p>
+            <w:r>
+              <w:t>**OpenAI / Codex**</w:t>
+            </w:r>
+          </w:p>
+        </w:tc>
+        <w:tc>
+          <w:tcPr>
+            <w:tcW w:type="dxa" w:w="2160"/>
+          </w:tcPr>
+          <w:p>
+            <w:r>
+              <w:t>GPT models, Codex, Assistants API, function calling</w:t>
+            </w:r>
+          </w:p>
+        </w:tc>
+        <w:tc>
+          <w:tcPr>
+            <w:tcW w:type="dxa" w:w="2160"/>
+          </w:tcPr>
+          <w:p>
+            <w:r>
+              <w:t>OpenAI certifications (as available)</w:t>
             </w:r>
           </w:p>
         </w:tc>
@@ -5846,17 +5515,27 @@
       <w:tr>
         <w:tc>
           <w:tcPr>
-            <w:tcW w:type="dxa" w:w="2880"/>
-          </w:tcPr>
-          <w:p>
-            <w:r>
-              <w:t>**AWS**</w:t>
-            </w:r>
-          </w:p>
-        </w:tc>
-        <w:tc>
-          <w:tcPr>
-            <w:tcW w:type="dxa" w:w="2880"/>
+            <w:tcW w:type="dxa" w:w="2160"/>
+          </w:tcPr>
+          <w:p>
+            <w:r>
+              <w:t>**Tier 2**</w:t>
+            </w:r>
+          </w:p>
+        </w:tc>
+        <w:tc>
+          <w:tcPr>
+            <w:tcW w:type="dxa" w:w="2160"/>
+          </w:tcPr>
+          <w:p>
+            <w:r>
+              <w:t>**AWS / Bedrock**</w:t>
+            </w:r>
+          </w:p>
+        </w:tc>
+        <w:tc>
+          <w:tcPr>
+            <w:tcW w:type="dxa" w:w="2160"/>
           </w:tcPr>
           <w:p>
             <w:r>
@@ -5866,7 +5545,7 @@
         </w:tc>
         <w:tc>
           <w:tcPr>
-            <w:tcW w:type="dxa" w:w="2880"/>
+            <w:tcW w:type="dxa" w:w="2160"/>
           </w:tcPr>
           <w:p>
             <w:r>
@@ -5878,31 +5557,41 @@
       <w:tr>
         <w:tc>
           <w:tcPr>
-            <w:tcW w:type="dxa" w:w="2880"/>
-          </w:tcPr>
-          <w:p>
-            <w:r>
-              <w:t>**Google Cloud**</w:t>
-            </w:r>
-          </w:p>
-        </w:tc>
-        <w:tc>
-          <w:tcPr>
-            <w:tcW w:type="dxa" w:w="2880"/>
-          </w:tcPr>
-          <w:p>
-            <w:r>
-              <w:t>Gemini, Vertex AI, AI Studio, Search grounding</w:t>
-            </w:r>
-          </w:p>
-        </w:tc>
-        <w:tc>
-          <w:tcPr>
-            <w:tcW w:type="dxa" w:w="2880"/>
-          </w:tcPr>
-          <w:p>
-            <w:r>
-              <w:t>Google Cloud Professional ML Engineer</w:t>
+            <w:tcW w:type="dxa" w:w="2160"/>
+          </w:tcPr>
+          <w:p>
+            <w:r>
+              <w:t>**Tier 2**</w:t>
+            </w:r>
+          </w:p>
+        </w:tc>
+        <w:tc>
+          <w:tcPr>
+            <w:tcW w:type="dxa" w:w="2160"/>
+          </w:tcPr>
+          <w:p>
+            <w:r>
+              <w:t>**Palantir**</w:t>
+            </w:r>
+          </w:p>
+        </w:tc>
+        <w:tc>
+          <w:tcPr>
+            <w:tcW w:type="dxa" w:w="2160"/>
+          </w:tcPr>
+          <w:p>
+            <w:r>
+              <w:t>Foundry, AIP, ontology-driven AI, pipeline orchestration</w:t>
+            </w:r>
+          </w:p>
+        </w:tc>
+        <w:tc>
+          <w:tcPr>
+            <w:tcW w:type="dxa" w:w="2160"/>
+          </w:tcPr>
+          <w:p>
+            <w:r>
+              <w:t>Palantir Foundry certification</w:t>
             </w:r>
           </w:p>
         </w:tc>
@@ -5910,31 +5599,41 @@
       <w:tr>
         <w:tc>
           <w:tcPr>
-            <w:tcW w:type="dxa" w:w="2880"/>
-          </w:tcPr>
-          <w:p>
-            <w:r>
-              <w:t>**OpenAI**</w:t>
-            </w:r>
-          </w:p>
-        </w:tc>
-        <w:tc>
-          <w:tcPr>
-            <w:tcW w:type="dxa" w:w="2880"/>
-          </w:tcPr>
-          <w:p>
-            <w:r>
-              <w:t>GPT models, Assistants API, function calling, GPTs</w:t>
-            </w:r>
-          </w:p>
-        </w:tc>
-        <w:tc>
-          <w:tcPr>
-            <w:tcW w:type="dxa" w:w="2880"/>
-          </w:tcPr>
-          <w:p>
-            <w:r>
-              <w:t>OpenAI certifications (as available)</w:t>
+            <w:tcW w:type="dxa" w:w="2160"/>
+          </w:tcPr>
+          <w:p>
+            <w:r>
+              <w:t>**Tier 3**</w:t>
+            </w:r>
+          </w:p>
+        </w:tc>
+        <w:tc>
+          <w:tcPr>
+            <w:tcW w:type="dxa" w:w="2160"/>
+          </w:tcPr>
+          <w:p>
+            <w:r>
+              <w:t>**GCP / Gemini**</w:t>
+            </w:r>
+          </w:p>
+        </w:tc>
+        <w:tc>
+          <w:tcPr>
+            <w:tcW w:type="dxa" w:w="2160"/>
+          </w:tcPr>
+          <w:p>
+            <w:r>
+              <w:t>Gemini, Vertex AI, AI Studio, Search grounding</w:t>
+            </w:r>
+          </w:p>
+        </w:tc>
+        <w:tc>
+          <w:tcPr>
+            <w:tcW w:type="dxa" w:w="2160"/>
+          </w:tcPr>
+          <w:p>
+            <w:r>
+              <w:t>Google Cloud Professional ML Engineer</w:t>
             </w:r>
           </w:p>
         </w:tc>
@@ -5942,31 +5641,41 @@
       <w:tr>
         <w:tc>
           <w:tcPr>
-            <w:tcW w:type="dxa" w:w="2880"/>
-          </w:tcPr>
-          <w:p>
-            <w:r>
-              <w:t>**IBM**</w:t>
-            </w:r>
-          </w:p>
-        </w:tc>
-        <w:tc>
-          <w:tcPr>
-            <w:tcW w:type="dxa" w:w="2880"/>
-          </w:tcPr>
-          <w:p>
-            <w:r>
-              <w:t>watsonx, Granite models, AI governance, OpenPages</w:t>
-            </w:r>
-          </w:p>
-        </w:tc>
-        <w:tc>
-          <w:tcPr>
-            <w:tcW w:type="dxa" w:w="2880"/>
-          </w:tcPr>
-          <w:p>
-            <w:r>
-              <w:t>IBM AI Engineering Professional</w:t>
+            <w:tcW w:type="dxa" w:w="2160"/>
+          </w:tcPr>
+          <w:p>
+            <w:r>
+              <w:t>**Tier 3**</w:t>
+            </w:r>
+          </w:p>
+        </w:tc>
+        <w:tc>
+          <w:tcPr>
+            <w:tcW w:type="dxa" w:w="2160"/>
+          </w:tcPr>
+          <w:p>
+            <w:r>
+              <w:t>**NVIDIA**</w:t>
+            </w:r>
+          </w:p>
+        </w:tc>
+        <w:tc>
+          <w:tcPr>
+            <w:tcW w:type="dxa" w:w="2160"/>
+          </w:tcPr>
+          <w:p>
+            <w:r>
+              <w:t>NIM microservices, GPU infrastructure, inference optimization, CUDA</w:t>
+            </w:r>
+          </w:p>
+        </w:tc>
+        <w:tc>
+          <w:tcPr>
+            <w:tcW w:type="dxa" w:w="2160"/>
+          </w:tcPr>
+          <w:p>
+            <w:r>
+              <w:t>NVIDIA Certified AI Solutions Architect</w:t>
             </w:r>
           </w:p>
         </w:tc>
@@ -5974,31 +5683,41 @@
       <w:tr>
         <w:tc>
           <w:tcPr>
-            <w:tcW w:type="dxa" w:w="2880"/>
-          </w:tcPr>
-          <w:p>
-            <w:r>
-              <w:t>**Palantir**</w:t>
-            </w:r>
-          </w:p>
-        </w:tc>
-        <w:tc>
-          <w:tcPr>
-            <w:tcW w:type="dxa" w:w="2880"/>
-          </w:tcPr>
-          <w:p>
-            <w:r>
-              <w:t>Foundry, AIP, ontology-driven AI, pipeline orchestration</w:t>
-            </w:r>
-          </w:p>
-        </w:tc>
-        <w:tc>
-          <w:tcPr>
-            <w:tcW w:type="dxa" w:w="2880"/>
-          </w:tcPr>
-          <w:p>
-            <w:r>
-              <w:t>Palantir Foundry certification</w:t>
+            <w:tcW w:type="dxa" w:w="2160"/>
+          </w:tcPr>
+          <w:p>
+            <w:r>
+              <w:t>**Tier 4**</w:t>
+            </w:r>
+          </w:p>
+        </w:tc>
+        <w:tc>
+          <w:tcPr>
+            <w:tcW w:type="dxa" w:w="2160"/>
+          </w:tcPr>
+          <w:p>
+            <w:r>
+              <w:t>**IBM**</w:t>
+            </w:r>
+          </w:p>
+        </w:tc>
+        <w:tc>
+          <w:tcPr>
+            <w:tcW w:type="dxa" w:w="2160"/>
+          </w:tcPr>
+          <w:p>
+            <w:r>
+              <w:t>watsonx, Granite models, AI governance, OpenPages</w:t>
+            </w:r>
+          </w:p>
+        </w:tc>
+        <w:tc>
+          <w:tcPr>
+            <w:tcW w:type="dxa" w:w="2160"/>
+          </w:tcPr>
+          <w:p>
+            <w:r>
+              <w:t>IBM AI Engineering Professional</w:t>
             </w:r>
           </w:p>
         </w:tc>
@@ -6006,39 +5725,17 @@
       <w:tr>
         <w:tc>
           <w:tcPr>
-            <w:tcW w:type="dxa" w:w="2880"/>
-          </w:tcPr>
-          <w:p>
-            <w:r>
-              <w:t>**Databricks**</w:t>
-            </w:r>
-          </w:p>
-        </w:tc>
-        <w:tc>
-          <w:tcPr>
-            <w:tcW w:type="dxa" w:w="2880"/>
-          </w:tcPr>
-          <w:p>
-            <w:r>
-              <w:t>Mosaic ML, Model Serving, lakehouse AI, MLflow</w:t>
-            </w:r>
-          </w:p>
-        </w:tc>
-        <w:tc>
-          <w:tcPr>
-            <w:tcW w:type="dxa" w:w="2880"/>
-          </w:tcPr>
-          <w:p>
-            <w:r>
-              <w:t>Databricks ML Professional</w:t>
-            </w:r>
-          </w:p>
-        </w:tc>
-      </w:tr>
-      <w:tr>
-        <w:tc>
-          <w:tcPr>
-            <w:tcW w:type="dxa" w:w="2880"/>
+            <w:tcW w:type="dxa" w:w="2160"/>
+          </w:tcPr>
+          <w:p>
+            <w:r>
+              <w:t>**Tier 4**</w:t>
+            </w:r>
+          </w:p>
+        </w:tc>
+        <w:tc>
+          <w:tcPr>
+            <w:tcW w:type="dxa" w:w="2160"/>
           </w:tcPr>
           <w:p>
             <w:r>
@@ -6048,17 +5745,17 @@
         </w:tc>
         <w:tc>
           <w:tcPr>
-            <w:tcW w:type="dxa" w:w="2880"/>
-          </w:tcPr>
-          <w:p>
-            <w:r>
-              <w:t>As client demand dictates</w:t>
-            </w:r>
-          </w:p>
-        </w:tc>
-        <w:tc>
-          <w:tcPr>
-            <w:tcW w:type="dxa" w:w="2880"/>
+            <w:tcW w:type="dxa" w:w="2160"/>
+          </w:tcPr>
+          <w:p>
+            <w:r>
+              <w:t>Cohere, Perplexity, LangChain, Mistral, LangGraph, LlamaIndex</w:t>
+            </w:r>
+          </w:p>
+        </w:tc>
+        <w:tc>
+          <w:tcPr>
+            <w:tcW w:type="dxa" w:w="2160"/>
           </w:tcPr>
           <w:p>
             <w:r>
@@ -6069,11 +5766,78 @@
       </w:tr>
     </w:tbl>
     <w:p>
-      <w:r>
-        <w:rPr>
-          <w:sz w:val="22"/>
-        </w:rPr>
-        <w:t>The train-the-trainer model compounds across technologies: a facilitator who has run the Anthropic cohort can run the AWS cohort with only Week 1 retraining, because the AI-Native Build Methodology skills transfer directly.</w:t>
+      <w:pPr>
+        <w:pStyle w:val="Heading3"/>
+      </w:pPr>
+      <w:r>
+        <w:t>Phase 1: Prove the Model (Q3 2026)</w:t>
+      </w:r>
+    </w:p>
+    <w:p>
+      <w:pPr>
+        <w:pStyle w:val="ListBullet"/>
+      </w:pPr>
+      <w:r>
+        <w:rPr>
+          <w:sz w:val="22"/>
+        </w:rPr>
+        <w:t>1 US cohort (Anthropic), 12 students, NYC</w:t>
+      </w:r>
+    </w:p>
+    <w:p>
+      <w:pPr>
+        <w:pStyle w:val="ListBullet"/>
+      </w:pPr>
+      <w:r>
+        <w:rPr>
+          <w:sz w:val="22"/>
+        </w:rPr>
+        <w:t>Produce 12 certification-ready Claude practitioners + 2-3 internal trainers</w:t>
+      </w:r>
+    </w:p>
+    <w:p>
+      <w:pPr>
+        <w:pStyle w:val="ListBullet"/>
+      </w:pPr>
+      <w:r>
+        <w:rPr>
+          <w:sz w:val="22"/>
+        </w:rPr>
+        <w:t>Output: proven curriculum, playbooks, facilitator guides, AI-Native Build Methodology</w:t>
+      </w:r>
+    </w:p>
+    <w:p>
+      <w:pPr>
+        <w:pStyle w:val="ListBullet"/>
+      </w:pPr>
+      <w:r>
+        <w:rPr>
+          <w:sz w:val="22"/>
+        </w:rPr>
+        <w:t>Design OpenAI/Codex Week 1 track in parallel</w:t>
+      </w:r>
+    </w:p>
+    <w:p>
+      <w:pPr>
+        <w:pStyle w:val="ListBullet"/>
+      </w:pPr>
+      <w:r>
+        <w:rPr>
+          <w:sz w:val="22"/>
+        </w:rPr>
+      </w:r>
+      <w:r>
+        <w:rPr>
+          <w:b/>
+          <w:sz w:val="22"/>
+        </w:rPr>
+        <w:t>$290,525</w:t>
+      </w:r>
+      <w:r>
+        <w:rPr>
+          <w:sz w:val="22"/>
+        </w:rPr>
+        <w:t xml:space="preserve"> (this ask)</w:t>
       </w:r>
     </w:p>
     <w:p>
@@ -6081,15 +5845,359 @@
         <w:pStyle w:val="Heading3"/>
       </w:pPr>
       <w:r>
-        <w:t>Geographic Reach</w:t>
+        <w:t>Phase 2: Dual-Vendor Launch + GDS Seed (Q4 2026)</w:t>
       </w:r>
     </w:p>
     <w:p>
-      <w:r>
-        <w:rPr>
-          <w:sz w:val="22"/>
-        </w:rPr>
-        <w:t>|-----------|-------------------|-----------------|</w:t>
+      <w:pPr>
+        <w:pStyle w:val="ListBullet"/>
+      </w:pPr>
+      <w:r>
+        <w:rPr>
+          <w:sz w:val="22"/>
+        </w:rPr>
+      </w:r>
+      <w:r>
+        <w:rPr>
+          <w:b/>
+          <w:sz w:val="22"/>
+        </w:rPr>
+        <w:t>US:</w:t>
+      </w:r>
+      <w:r>
+        <w:rPr>
+          <w:sz w:val="22"/>
+        </w:rPr>
+        <w:t xml:space="preserve"> 4 Anthropic cohorts (NYC, Chicago, Dallas, SF) + 2 OpenAI/Codex cohorts × 24 students = </w:t>
+      </w:r>
+      <w:r>
+        <w:rPr>
+          <w:b/>
+          <w:sz w:val="22"/>
+        </w:rPr>
+        <w:t>144 US practitioners</w:t>
+      </w:r>
+      <w:r>
+        <w:rPr>
+          <w:sz w:val="22"/>
+        </w:rPr>
+      </w:r>
+    </w:p>
+    <w:p>
+      <w:pPr>
+        <w:pStyle w:val="ListBullet"/>
+      </w:pPr>
+      <w:r>
+        <w:rPr>
+          <w:sz w:val="22"/>
+        </w:rPr>
+      </w:r>
+      <w:r>
+        <w:rPr>
+          <w:b/>
+          <w:sz w:val="22"/>
+        </w:rPr>
+        <w:t>GDS India:</w:t>
+      </w:r>
+      <w:r>
+        <w:rPr>
+          <w:sz w:val="22"/>
+        </w:rPr>
+        <w:t xml:space="preserve"> 2 Anthropic cohorts × 36 students = </w:t>
+      </w:r>
+      <w:r>
+        <w:rPr>
+          <w:b/>
+          <w:sz w:val="22"/>
+        </w:rPr>
+        <w:t>72 GDS practitioners</w:t>
+      </w:r>
+      <w:r>
+        <w:rPr>
+          <w:sz w:val="22"/>
+        </w:rPr>
+        <w:t xml:space="preserve"> (Bangalore, co-facilitated by Phase 1 graduates)</w:t>
+      </w:r>
+    </w:p>
+    <w:p>
+      <w:pPr>
+        <w:pStyle w:val="ListBullet"/>
+      </w:pPr>
+      <w:r>
+        <w:rPr>
+          <w:sz w:val="22"/>
+        </w:rPr>
+        <w:t>Design AWS/Bedrock and Palantir Week 1 tracks</w:t>
+      </w:r>
+    </w:p>
+    <w:p>
+      <w:pPr>
+        <w:pStyle w:val="ListBullet"/>
+      </w:pPr>
+      <w:r>
+        <w:rPr>
+          <w:sz w:val="22"/>
+        </w:rPr>
+        <w:t>Trainer pool grows to ~15 facilitators</w:t>
+      </w:r>
+    </w:p>
+    <w:p>
+      <w:pPr>
+        <w:pStyle w:val="ListBullet"/>
+      </w:pPr>
+      <w:r>
+        <w:rPr>
+          <w:sz w:val="22"/>
+        </w:rPr>
+        <w:t>GDS cohorts at ~$7,500/student (vs $24,200/student US) — 3x the scale per dollar</w:t>
+      </w:r>
+    </w:p>
+    <w:p>
+      <w:pPr>
+        <w:pStyle w:val="Heading3"/>
+      </w:pPr>
+      <w:r>
+        <w:t>Phase 3: Multi-Vendor Ramp (Q1 2027)</w:t>
+      </w:r>
+    </w:p>
+    <w:p>
+      <w:pPr>
+        <w:pStyle w:val="ListBullet"/>
+      </w:pPr>
+      <w:r>
+        <w:rPr>
+          <w:sz w:val="22"/>
+        </w:rPr>
+      </w:r>
+      <w:r>
+        <w:rPr>
+          <w:b/>
+          <w:sz w:val="22"/>
+        </w:rPr>
+        <w:t>US:</w:t>
+      </w:r>
+      <w:r>
+        <w:rPr>
+          <w:sz w:val="22"/>
+        </w:rPr>
+        <w:t xml:space="preserve"> Running 8-10 cohorts/month across Anthropic, OpenAI, AWS, Palantir × 24 students = </w:t>
+      </w:r>
+      <w:r>
+        <w:rPr>
+          <w:b/>
+          <w:sz w:val="22"/>
+        </w:rPr>
+        <w:t>~240 US practitioners/month</w:t>
+      </w:r>
+      <w:r>
+        <w:rPr>
+          <w:sz w:val="22"/>
+        </w:rPr>
+      </w:r>
+    </w:p>
+    <w:p>
+      <w:pPr>
+        <w:pStyle w:val="ListBullet"/>
+      </w:pPr>
+      <w:r>
+        <w:rPr>
+          <w:sz w:val="22"/>
+        </w:rPr>
+      </w:r>
+      <w:r>
+        <w:rPr>
+          <w:b/>
+          <w:sz w:val="22"/>
+        </w:rPr>
+        <w:t>GDS India + Mexico:</w:t>
+      </w:r>
+      <w:r>
+        <w:rPr>
+          <w:sz w:val="22"/>
+        </w:rPr>
+        <w:t xml:space="preserve"> 8-10 cohorts/month × 36 students = </w:t>
+      </w:r>
+      <w:r>
+        <w:rPr>
+          <w:b/>
+          <w:sz w:val="22"/>
+        </w:rPr>
+        <w:t>~360 GDS practitioners/month</w:t>
+      </w:r>
+      <w:r>
+        <w:rPr>
+          <w:sz w:val="22"/>
+        </w:rPr>
+      </w:r>
+    </w:p>
+    <w:p>
+      <w:pPr>
+        <w:pStyle w:val="ListBullet"/>
+      </w:pPr>
+      <w:r>
+        <w:rPr>
+          <w:sz w:val="22"/>
+        </w:rPr>
+        <w:t>Launch GCP/Gemini and NVIDIA Week 1 tracks</w:t>
+      </w:r>
+    </w:p>
+    <w:p>
+      <w:pPr>
+        <w:pStyle w:val="ListBullet"/>
+      </w:pPr>
+      <w:r>
+        <w:rPr>
+          <w:sz w:val="22"/>
+        </w:rPr>
+        <w:t>Trainer pool: ~40 facilitators (self-sustaining — new trainers produced faster than consumed)</w:t>
+      </w:r>
+    </w:p>
+    <w:p>
+      <w:pPr>
+        <w:pStyle w:val="Heading3"/>
+      </w:pPr>
+      <w:r>
+        <w:t>Phase 4: Full Portfolio at Scale (Q2-Q3 2027)</w:t>
+      </w:r>
+    </w:p>
+    <w:p>
+      <w:pPr>
+        <w:pStyle w:val="ListBullet"/>
+      </w:pPr>
+      <w:r>
+        <w:rPr>
+          <w:sz w:val="22"/>
+        </w:rPr>
+      </w:r>
+      <w:r>
+        <w:rPr>
+          <w:b/>
+          <w:sz w:val="22"/>
+        </w:rPr>
+        <w:t>US:</w:t>
+      </w:r>
+      <w:r>
+        <w:rPr>
+          <w:sz w:val="22"/>
+        </w:rPr>
+        <w:t xml:space="preserve"> 12-15 cohorts/month across all Tier 1-3 vendors = </w:t>
+      </w:r>
+      <w:r>
+        <w:rPr>
+          <w:b/>
+          <w:sz w:val="22"/>
+        </w:rPr>
+        <w:t>~300 US practitioners/month</w:t>
+      </w:r>
+      <w:r>
+        <w:rPr>
+          <w:sz w:val="22"/>
+        </w:rPr>
+      </w:r>
+    </w:p>
+    <w:p>
+      <w:pPr>
+        <w:pStyle w:val="ListBullet"/>
+      </w:pPr>
+      <w:r>
+        <w:rPr>
+          <w:sz w:val="22"/>
+        </w:rPr>
+      </w:r>
+      <w:r>
+        <w:rPr>
+          <w:b/>
+          <w:sz w:val="22"/>
+        </w:rPr>
+        <w:t>GDS:</w:t>
+      </w:r>
+      <w:r>
+        <w:rPr>
+          <w:sz w:val="22"/>
+        </w:rPr>
+        <w:t xml:space="preserve"> 20-30 cohorts/month across India + Mexico = </w:t>
+      </w:r>
+      <w:r>
+        <w:rPr>
+          <w:b/>
+          <w:sz w:val="22"/>
+        </w:rPr>
+        <w:t>~900 GDS practitioners/month</w:t>
+      </w:r>
+      <w:r>
+        <w:rPr>
+          <w:sz w:val="22"/>
+        </w:rPr>
+      </w:r>
+    </w:p>
+    <w:p>
+      <w:pPr>
+        <w:pStyle w:val="ListBullet"/>
+      </w:pPr>
+      <w:r>
+        <w:rPr>
+          <w:sz w:val="22"/>
+        </w:rPr>
+        <w:t>Add IBM, Cohere, Perplexity, LangChain, Mistral, LangGraph, LlamaIndex</w:t>
+      </w:r>
+    </w:p>
+    <w:p>
+      <w:pPr>
+        <w:pStyle w:val="ListBullet"/>
+      </w:pPr>
+      <w:r>
+        <w:rPr>
+          <w:sz w:val="22"/>
+        </w:rPr>
+        <w:t>Trainer pool: 80+ facilitators, fully self-sustaining</w:t>
+      </w:r>
+    </w:p>
+    <w:p>
+      <w:pPr>
+        <w:pStyle w:val="ListBullet"/>
+      </w:pPr>
+      <w:r>
+        <w:rPr>
+          <w:sz w:val="22"/>
+        </w:rPr>
+        <w:t xml:space="preserve">Unit cost per cohort drops to </w:t>
+      </w:r>
+      <w:r>
+        <w:rPr>
+          <w:b/>
+          <w:sz w:val="22"/>
+        </w:rPr>
+        <w:t>~$50-80K</w:t>
+      </w:r>
+      <w:r>
+        <w:rPr>
+          <w:sz w:val="22"/>
+        </w:rPr>
+        <w:t xml:space="preserve"> (no methodology design, internal facilitators, GDS cost rates)</w:t>
+      </w:r>
+    </w:p>
+    <w:p>
+      <w:pPr>
+        <w:pStyle w:val="Heading3"/>
+      </w:pPr>
+      <w:r>
+        <w:t>How the Math Works</w:t>
+      </w:r>
+    </w:p>
+    <w:p>
+      <w:r>
+        <w:rPr>
+          <w:sz w:val="22"/>
+        </w:rPr>
+        <w:t>The train-the-trainer model creates exponential growth:</w:t>
+      </w:r>
+    </w:p>
+    <w:p>
+      <w:r>
+        <w:rPr>
+          <w:sz w:val="22"/>
+        </w:rPr>
+        <w:t>|---------|-----------|-----------------|------------|-------------------|--------------|---------------|----------|</w:t>
       </w:r>
     </w:p>
     <w:tbl>
@@ -6099,47 +6207,117 @@
         <w:tblLook w:firstColumn="1" w:firstRow="1" w:lastColumn="0" w:lastRow="0" w:noHBand="0" w:noVBand="1" w:val="04A0"/>
       </w:tblPr>
       <w:tblGrid>
-        <w:gridCol w:w="2880"/>
-        <w:gridCol w:w="2880"/>
-        <w:gridCol w:w="2880"/>
+        <w:gridCol w:w="1080"/>
+        <w:gridCol w:w="1080"/>
+        <w:gridCol w:w="1080"/>
+        <w:gridCol w:w="1080"/>
+        <w:gridCol w:w="1080"/>
+        <w:gridCol w:w="1080"/>
+        <w:gridCol w:w="1080"/>
+        <w:gridCol w:w="1080"/>
       </w:tblGrid>
       <w:tr>
         <w:tc>
           <w:tcPr>
-            <w:tcW w:type="dxa" w:w="2880"/>
+            <w:tcW w:type="dxa" w:w="1080"/>
           </w:tcPr>
           <w:p>
             <w:r>
               <w:rPr>
                 <w:b/>
               </w:rPr>
-              <w:t>Geography</w:t>
-            </w:r>
-          </w:p>
-        </w:tc>
-        <w:tc>
-          <w:tcPr>
-            <w:tcW w:type="dxa" w:w="2880"/>
+              <w:t>Quarter</w:t>
+            </w:r>
+          </w:p>
+        </w:tc>
+        <w:tc>
+          <w:tcPr>
+            <w:tcW w:type="dxa" w:w="1080"/>
           </w:tcPr>
           <w:p>
             <w:r>
               <w:rPr>
                 <w:b/>
               </w:rPr>
-              <w:t>Cohort Cost Profile</w:t>
-            </w:r>
-          </w:p>
-        </w:tc>
-        <w:tc>
-          <w:tcPr>
-            <w:tcW w:type="dxa" w:w="2880"/>
+              <w:t>US Cohorts</w:t>
+            </w:r>
+          </w:p>
+        </w:tc>
+        <w:tc>
+          <w:tcPr>
+            <w:tcW w:type="dxa" w:w="1080"/>
           </w:tcPr>
           <w:p>
             <w:r>
               <w:rPr>
                 <w:b/>
               </w:rPr>
-              <w:t>Strategic Value</w:t>
+              <w:t>US Practitioners</w:t>
+            </w:r>
+          </w:p>
+        </w:tc>
+        <w:tc>
+          <w:tcPr>
+            <w:tcW w:type="dxa" w:w="1080"/>
+          </w:tcPr>
+          <w:p>
+            <w:r>
+              <w:rPr>
+                <w:b/>
+              </w:rPr>
+              <w:t>GDS Cohorts</w:t>
+            </w:r>
+          </w:p>
+        </w:tc>
+        <w:tc>
+          <w:tcPr>
+            <w:tcW w:type="dxa" w:w="1080"/>
+          </w:tcPr>
+          <w:p>
+            <w:r>
+              <w:rPr>
+                <w:b/>
+              </w:rPr>
+              <w:t>GDS Practitioners</w:t>
+            </w:r>
+          </w:p>
+        </w:tc>
+        <w:tc>
+          <w:tcPr>
+            <w:tcW w:type="dxa" w:w="1080"/>
+          </w:tcPr>
+          <w:p>
+            <w:r>
+              <w:rPr>
+                <w:b/>
+              </w:rPr>
+              <w:t>Cumulative US</w:t>
+            </w:r>
+          </w:p>
+        </w:tc>
+        <w:tc>
+          <w:tcPr>
+            <w:tcW w:type="dxa" w:w="1080"/>
+          </w:tcPr>
+          <w:p>
+            <w:r>
+              <w:rPr>
+                <w:b/>
+              </w:rPr>
+              <w:t>Cumulative GDS</w:t>
+            </w:r>
+          </w:p>
+        </w:tc>
+        <w:tc>
+          <w:tcPr>
+            <w:tcW w:type="dxa" w:w="1080"/>
+          </w:tcPr>
+          <w:p>
+            <w:r>
+              <w:rPr>
+                <w:b/>
+              </w:rPr>
+              <w:t>Trainers</w:t>
             </w:r>
           </w:p>
         </w:tc>
@@ -6147,31 +6325,81 @@
       <w:tr>
         <w:tc>
           <w:tcPr>
-            <w:tcW w:type="dxa" w:w="2880"/>
-          </w:tcPr>
-          <w:p>
-            <w:r>
-              <w:t>**US (multi-city)**</w:t>
-            </w:r>
-          </w:p>
-        </w:tc>
-        <w:tc>
-          <w:tcPr>
-            <w:tcW w:type="dxa" w:w="2880"/>
-          </w:tcPr>
-          <w:p>
-            <w:r>
-              <w:t>~$290K per cohort (at onshore rates)</w:t>
-            </w:r>
-          </w:p>
-        </w:tc>
-        <w:tc>
-          <w:tcPr>
-            <w:tcW w:type="dxa" w:w="2880"/>
-          </w:tcPr>
-          <w:p>
-            <w:r>
-              <w:t>Client-facing delivery bench, trainer pipeline</w:t>
+            <w:tcW w:type="dxa" w:w="1080"/>
+          </w:tcPr>
+          <w:p>
+            <w:r>
+              <w:t>Q3 2026</w:t>
+            </w:r>
+          </w:p>
+        </w:tc>
+        <w:tc>
+          <w:tcPr>
+            <w:tcW w:type="dxa" w:w="1080"/>
+          </w:tcPr>
+          <w:p>
+            <w:r>
+              <w:t>1</w:t>
+            </w:r>
+          </w:p>
+        </w:tc>
+        <w:tc>
+          <w:tcPr>
+            <w:tcW w:type="dxa" w:w="1080"/>
+          </w:tcPr>
+          <w:p>
+            <w:r>
+              <w:t>12</w:t>
+            </w:r>
+          </w:p>
+        </w:tc>
+        <w:tc>
+          <w:tcPr>
+            <w:tcW w:type="dxa" w:w="1080"/>
+          </w:tcPr>
+          <w:p>
+            <w:r>
+              <w:t>—</w:t>
+            </w:r>
+          </w:p>
+        </w:tc>
+        <w:tc>
+          <w:tcPr>
+            <w:tcW w:type="dxa" w:w="1080"/>
+          </w:tcPr>
+          <w:p>
+            <w:r>
+              <w:t>—</w:t>
+            </w:r>
+          </w:p>
+        </w:tc>
+        <w:tc>
+          <w:tcPr>
+            <w:tcW w:type="dxa" w:w="1080"/>
+          </w:tcPr>
+          <w:p>
+            <w:r>
+              <w:t>12</w:t>
+            </w:r>
+          </w:p>
+        </w:tc>
+        <w:tc>
+          <w:tcPr>
+            <w:tcW w:type="dxa" w:w="1080"/>
+          </w:tcPr>
+          <w:p>
+            <w:r>
+              <w:t>—</w:t>
+            </w:r>
+          </w:p>
+        </w:tc>
+        <w:tc>
+          <w:tcPr>
+            <w:tcW w:type="dxa" w:w="1080"/>
+          </w:tcPr>
+          <w:p>
+            <w:r>
+              <w:t>3 → 6</w:t>
             </w:r>
           </w:p>
         </w:tc>
@@ -6179,31 +6407,81 @@
       <w:tr>
         <w:tc>
           <w:tcPr>
-            <w:tcW w:type="dxa" w:w="2880"/>
-          </w:tcPr>
-          <w:p>
-            <w:r>
-              <w:t>**GDS India**</w:t>
-            </w:r>
-          </w:p>
-        </w:tc>
-        <w:tc>
-          <w:tcPr>
-            <w:tcW w:type="dxa" w:w="2880"/>
-          </w:tcPr>
-          <w:p>
-            <w:r>
-              <w:t>~$180K per cohort (24 students, lower labor rates, higher travel)</w:t>
-            </w:r>
-          </w:p>
-        </w:tc>
-        <w:tc>
-          <w:tcPr>
-            <w:tcW w:type="dxa" w:w="2880"/>
-          </w:tcPr>
-          <w:p>
-            <w:r>
-              <w:t>Cost-efficient scale, 24/7 delivery capability</w:t>
+            <w:tcW w:type="dxa" w:w="1080"/>
+          </w:tcPr>
+          <w:p>
+            <w:r>
+              <w:t>Q4 2026</w:t>
+            </w:r>
+          </w:p>
+        </w:tc>
+        <w:tc>
+          <w:tcPr>
+            <w:tcW w:type="dxa" w:w="1080"/>
+          </w:tcPr>
+          <w:p>
+            <w:r>
+              <w:t>6</w:t>
+            </w:r>
+          </w:p>
+        </w:tc>
+        <w:tc>
+          <w:tcPr>
+            <w:tcW w:type="dxa" w:w="1080"/>
+          </w:tcPr>
+          <w:p>
+            <w:r>
+              <w:t>144</w:t>
+            </w:r>
+          </w:p>
+        </w:tc>
+        <w:tc>
+          <w:tcPr>
+            <w:tcW w:type="dxa" w:w="1080"/>
+          </w:tcPr>
+          <w:p>
+            <w:r>
+              <w:t>2</w:t>
+            </w:r>
+          </w:p>
+        </w:tc>
+        <w:tc>
+          <w:tcPr>
+            <w:tcW w:type="dxa" w:w="1080"/>
+          </w:tcPr>
+          <w:p>
+            <w:r>
+              <w:t>72</w:t>
+            </w:r>
+          </w:p>
+        </w:tc>
+        <w:tc>
+          <w:tcPr>
+            <w:tcW w:type="dxa" w:w="1080"/>
+          </w:tcPr>
+          <w:p>
+            <w:r>
+              <w:t>156</w:t>
+            </w:r>
+          </w:p>
+        </w:tc>
+        <w:tc>
+          <w:tcPr>
+            <w:tcW w:type="dxa" w:w="1080"/>
+          </w:tcPr>
+          <w:p>
+            <w:r>
+              <w:t>72</w:t>
+            </w:r>
+          </w:p>
+        </w:tc>
+        <w:tc>
+          <w:tcPr>
+            <w:tcW w:type="dxa" w:w="1080"/>
+          </w:tcPr>
+          <w:p>
+            <w:r>
+              <w:t>6 → 15</w:t>
             </w:r>
           </w:p>
         </w:tc>
@@ -6211,42 +6489,621 @@
       <w:tr>
         <w:tc>
           <w:tcPr>
-            <w:tcW w:type="dxa" w:w="2880"/>
-          </w:tcPr>
-          <w:p>
-            <w:r>
-              <w:t>**GDS Mexico**</w:t>
-            </w:r>
-          </w:p>
-        </w:tc>
-        <w:tc>
-          <w:tcPr>
-            <w:tcW w:type="dxa" w:w="2880"/>
-          </w:tcPr>
-          <w:p>
-            <w:r>
-              <w:t>~$120K per cohort (lower labor, lower travel than India)</w:t>
-            </w:r>
-          </w:p>
-        </w:tc>
-        <w:tc>
-          <w:tcPr>
-            <w:tcW w:type="dxa" w:w="2880"/>
-          </w:tcPr>
-          <w:p>
-            <w:r>
-              <w:t>Nearshore bench, US time zone alignment</w:t>
+            <w:tcW w:type="dxa" w:w="1080"/>
+          </w:tcPr>
+          <w:p>
+            <w:r>
+              <w:t>Q1 2027</w:t>
+            </w:r>
+          </w:p>
+        </w:tc>
+        <w:tc>
+          <w:tcPr>
+            <w:tcW w:type="dxa" w:w="1080"/>
+          </w:tcPr>
+          <w:p>
+            <w:r>
+              <w:t>10</w:t>
+            </w:r>
+          </w:p>
+        </w:tc>
+        <w:tc>
+          <w:tcPr>
+            <w:tcW w:type="dxa" w:w="1080"/>
+          </w:tcPr>
+          <w:p>
+            <w:r>
+              <w:t>240</w:t>
+            </w:r>
+          </w:p>
+        </w:tc>
+        <w:tc>
+          <w:tcPr>
+            <w:tcW w:type="dxa" w:w="1080"/>
+          </w:tcPr>
+          <w:p>
+            <w:r>
+              <w:t>10</w:t>
+            </w:r>
+          </w:p>
+        </w:tc>
+        <w:tc>
+          <w:tcPr>
+            <w:tcW w:type="dxa" w:w="1080"/>
+          </w:tcPr>
+          <w:p>
+            <w:r>
+              <w:t>360</w:t>
+            </w:r>
+          </w:p>
+        </w:tc>
+        <w:tc>
+          <w:tcPr>
+            <w:tcW w:type="dxa" w:w="1080"/>
+          </w:tcPr>
+          <w:p>
+            <w:r>
+              <w:t>396</w:t>
+            </w:r>
+          </w:p>
+        </w:tc>
+        <w:tc>
+          <w:tcPr>
+            <w:tcW w:type="dxa" w:w="1080"/>
+          </w:tcPr>
+          <w:p>
+            <w:r>
+              <w:t>432</w:t>
+            </w:r>
+          </w:p>
+        </w:tc>
+        <w:tc>
+          <w:tcPr>
+            <w:tcW w:type="dxa" w:w="1080"/>
+          </w:tcPr>
+          <w:p>
+            <w:r>
+              <w:t>15 → 40</w:t>
+            </w:r>
+          </w:p>
+        </w:tc>
+      </w:tr>
+      <w:tr>
+        <w:tc>
+          <w:tcPr>
+            <w:tcW w:type="dxa" w:w="1080"/>
+          </w:tcPr>
+          <w:p>
+            <w:r>
+              <w:t>Q2 2027</w:t>
+            </w:r>
+          </w:p>
+        </w:tc>
+        <w:tc>
+          <w:tcPr>
+            <w:tcW w:type="dxa" w:w="1080"/>
+          </w:tcPr>
+          <w:p>
+            <w:r>
+              <w:t>12</w:t>
+            </w:r>
+          </w:p>
+        </w:tc>
+        <w:tc>
+          <w:tcPr>
+            <w:tcW w:type="dxa" w:w="1080"/>
+          </w:tcPr>
+          <w:p>
+            <w:r>
+              <w:t>288</w:t>
+            </w:r>
+          </w:p>
+        </w:tc>
+        <w:tc>
+          <w:tcPr>
+            <w:tcW w:type="dxa" w:w="1080"/>
+          </w:tcPr>
+          <w:p>
+            <w:r>
+              <w:t>20</w:t>
+            </w:r>
+          </w:p>
+        </w:tc>
+        <w:tc>
+          <w:tcPr>
+            <w:tcW w:type="dxa" w:w="1080"/>
+          </w:tcPr>
+          <w:p>
+            <w:r>
+              <w:t>720</w:t>
+            </w:r>
+          </w:p>
+        </w:tc>
+        <w:tc>
+          <w:tcPr>
+            <w:tcW w:type="dxa" w:w="1080"/>
+          </w:tcPr>
+          <w:p>
+            <w:r>
+              <w:t>684</w:t>
+            </w:r>
+          </w:p>
+        </w:tc>
+        <w:tc>
+          <w:tcPr>
+            <w:tcW w:type="dxa" w:w="1080"/>
+          </w:tcPr>
+          <w:p>
+            <w:r>
+              <w:t>1,152</w:t>
+            </w:r>
+          </w:p>
+        </w:tc>
+        <w:tc>
+          <w:tcPr>
+            <w:tcW w:type="dxa" w:w="1080"/>
+          </w:tcPr>
+          <w:p>
+            <w:r>
+              <w:t>40 → 60</w:t>
+            </w:r>
+          </w:p>
+        </w:tc>
+      </w:tr>
+      <w:tr>
+        <w:tc>
+          <w:tcPr>
+            <w:tcW w:type="dxa" w:w="1080"/>
+          </w:tcPr>
+          <w:p>
+            <w:r>
+              <w:t>Q3 2027</w:t>
+            </w:r>
+          </w:p>
+        </w:tc>
+        <w:tc>
+          <w:tcPr>
+            <w:tcW w:type="dxa" w:w="1080"/>
+          </w:tcPr>
+          <w:p>
+            <w:r>
+              <w:t>15</w:t>
+            </w:r>
+          </w:p>
+        </w:tc>
+        <w:tc>
+          <w:tcPr>
+            <w:tcW w:type="dxa" w:w="1080"/>
+          </w:tcPr>
+          <w:p>
+            <w:r>
+              <w:t>360</w:t>
+            </w:r>
+          </w:p>
+        </w:tc>
+        <w:tc>
+          <w:tcPr>
+            <w:tcW w:type="dxa" w:w="1080"/>
+          </w:tcPr>
+          <w:p>
+            <w:r>
+              <w:t>30</w:t>
+            </w:r>
+          </w:p>
+        </w:tc>
+        <w:tc>
+          <w:tcPr>
+            <w:tcW w:type="dxa" w:w="1080"/>
+          </w:tcPr>
+          <w:p>
+            <w:r>
+              <w:t>1,080</w:t>
+            </w:r>
+          </w:p>
+        </w:tc>
+        <w:tc>
+          <w:tcPr>
+            <w:tcW w:type="dxa" w:w="1080"/>
+          </w:tcPr>
+          <w:p>
+            <w:r>
+              <w:t>**1,044**</w:t>
+            </w:r>
+          </w:p>
+        </w:tc>
+        <w:tc>
+          <w:tcPr>
+            <w:tcW w:type="dxa" w:w="1080"/>
+          </w:tcPr>
+          <w:p>
+            <w:r>
+              <w:t>2,232</w:t>
+            </w:r>
+          </w:p>
+        </w:tc>
+        <w:tc>
+          <w:tcPr>
+            <w:tcW w:type="dxa" w:w="1080"/>
+          </w:tcPr>
+          <w:p>
+            <w:r>
+              <w:t>60 → 80+</w:t>
+            </w:r>
+          </w:p>
+        </w:tc>
+      </w:tr>
+      <w:tr>
+        <w:tc>
+          <w:tcPr>
+            <w:tcW w:type="dxa" w:w="1080"/>
+          </w:tcPr>
+          <w:p>
+            <w:r>
+              <w:t>Q4 2027</w:t>
+            </w:r>
+          </w:p>
+        </w:tc>
+        <w:tc>
+          <w:tcPr>
+            <w:tcW w:type="dxa" w:w="1080"/>
+          </w:tcPr>
+          <w:p>
+            <w:r>
+              <w:t>15</w:t>
+            </w:r>
+          </w:p>
+        </w:tc>
+        <w:tc>
+          <w:tcPr>
+            <w:tcW w:type="dxa" w:w="1080"/>
+          </w:tcPr>
+          <w:p>
+            <w:r>
+              <w:t>360</w:t>
+            </w:r>
+          </w:p>
+        </w:tc>
+        <w:tc>
+          <w:tcPr>
+            <w:tcW w:type="dxa" w:w="1080"/>
+          </w:tcPr>
+          <w:p>
+            <w:r>
+              <w:t>30</w:t>
+            </w:r>
+          </w:p>
+        </w:tc>
+        <w:tc>
+          <w:tcPr>
+            <w:tcW w:type="dxa" w:w="1080"/>
+          </w:tcPr>
+          <w:p>
+            <w:r>
+              <w:t>1,080</w:t>
+            </w:r>
+          </w:p>
+        </w:tc>
+        <w:tc>
+          <w:tcPr>
+            <w:tcW w:type="dxa" w:w="1080"/>
+          </w:tcPr>
+          <w:p>
+            <w:r>
+              <w:t>1,404</w:t>
+            </w:r>
+          </w:p>
+        </w:tc>
+        <w:tc>
+          <w:tcPr>
+            <w:tcW w:type="dxa" w:w="1080"/>
+          </w:tcPr>
+          <w:p>
+            <w:r>
+              <w:t>3,312</w:t>
+            </w:r>
+          </w:p>
+        </w:tc>
+        <w:tc>
+          <w:tcPr>
+            <w:tcW w:type="dxa" w:w="1080"/>
+          </w:tcPr>
+          <w:p>
+            <w:r>
+              <w:t>80+</w:t>
+            </w:r>
+          </w:p>
+        </w:tc>
+      </w:tr>
+      <w:tr>
+        <w:tc>
+          <w:tcPr>
+            <w:tcW w:type="dxa" w:w="1080"/>
+          </w:tcPr>
+          <w:p>
+            <w:r>
+              <w:t>Q1 2028</w:t>
+            </w:r>
+          </w:p>
+        </w:tc>
+        <w:tc>
+          <w:tcPr>
+            <w:tcW w:type="dxa" w:w="1080"/>
+          </w:tcPr>
+          <w:p>
+            <w:r>
+              <w:t>15</w:t>
+            </w:r>
+          </w:p>
+        </w:tc>
+        <w:tc>
+          <w:tcPr>
+            <w:tcW w:type="dxa" w:w="1080"/>
+          </w:tcPr>
+          <w:p>
+            <w:r>
+              <w:t>360</w:t>
+            </w:r>
+          </w:p>
+        </w:tc>
+        <w:tc>
+          <w:tcPr>
+            <w:tcW w:type="dxa" w:w="1080"/>
+          </w:tcPr>
+          <w:p>
+            <w:r>
+              <w:t>25</w:t>
+            </w:r>
+          </w:p>
+        </w:tc>
+        <w:tc>
+          <w:tcPr>
+            <w:tcW w:type="dxa" w:w="1080"/>
+          </w:tcPr>
+          <w:p>
+            <w:r>
+              <w:t>900</w:t>
+            </w:r>
+          </w:p>
+        </w:tc>
+        <w:tc>
+          <w:tcPr>
+            <w:tcW w:type="dxa" w:w="1080"/>
+          </w:tcPr>
+          <w:p>
+            <w:r>
+              <w:t>1,764</w:t>
+            </w:r>
+          </w:p>
+        </w:tc>
+        <w:tc>
+          <w:tcPr>
+            <w:tcW w:type="dxa" w:w="1080"/>
+          </w:tcPr>
+          <w:p>
+            <w:r>
+              <w:t>4,212</w:t>
+            </w:r>
+          </w:p>
+        </w:tc>
+        <w:tc>
+          <w:tcPr>
+            <w:tcW w:type="dxa" w:w="1080"/>
+          </w:tcPr>
+          <w:p>
+            <w:r>
+              <w:t>80+</w:t>
+            </w:r>
+          </w:p>
+        </w:tc>
+      </w:tr>
+      <w:tr>
+        <w:tc>
+          <w:tcPr>
+            <w:tcW w:type="dxa" w:w="1080"/>
+          </w:tcPr>
+          <w:p>
+            <w:r>
+              <w:t>Q2 2028</w:t>
+            </w:r>
+          </w:p>
+        </w:tc>
+        <w:tc>
+          <w:tcPr>
+            <w:tcW w:type="dxa" w:w="1080"/>
+          </w:tcPr>
+          <w:p>
+            <w:r>
+              <w:t>—</w:t>
+            </w:r>
+          </w:p>
+        </w:tc>
+        <w:tc>
+          <w:tcPr>
+            <w:tcW w:type="dxa" w:w="1080"/>
+          </w:tcPr>
+          <w:p>
+            <w:r>
+              <w:t>—</w:t>
+            </w:r>
+          </w:p>
+        </w:tc>
+        <w:tc>
+          <w:tcPr>
+            <w:tcW w:type="dxa" w:w="1080"/>
+          </w:tcPr>
+          <w:p>
+            <w:r>
+              <w:t>22</w:t>
+            </w:r>
+          </w:p>
+        </w:tc>
+        <w:tc>
+          <w:tcPr>
+            <w:tcW w:type="dxa" w:w="1080"/>
+          </w:tcPr>
+          <w:p>
+            <w:r>
+              <w:t>792</w:t>
+            </w:r>
+          </w:p>
+        </w:tc>
+        <w:tc>
+          <w:tcPr>
+            <w:tcW w:type="dxa" w:w="1080"/>
+          </w:tcPr>
+          <w:p>
+            <w:r>
+              <w:t>—</w:t>
+            </w:r>
+          </w:p>
+        </w:tc>
+        <w:tc>
+          <w:tcPr>
+            <w:tcW w:type="dxa" w:w="1080"/>
+          </w:tcPr>
+          <w:p>
+            <w:r>
+              <w:t>**5,004**</w:t>
+            </w:r>
+          </w:p>
+        </w:tc>
+        <w:tc>
+          <w:tcPr>
+            <w:tcW w:type="dxa" w:w="1080"/>
+          </w:tcPr>
+          <w:p>
+            <w:r>
+              <w:t>Self-sustaining</w:t>
             </w:r>
           </w:p>
         </w:tc>
       </w:tr>
     </w:tbl>
+    <w:p>
+      <w:r>
+        <w:rPr>
+          <w:sz w:val="22"/>
+        </w:rPr>
+      </w:r>
+      <w:r>
+        <w:rPr>
+          <w:b/>
+          <w:sz w:val="22"/>
+        </w:rPr>
+        <w:t>US target (~1,000) reached by Q3 2027. GDS target (~5,000) reached by Q2 2028.</w:t>
+      </w:r>
+      <w:r>
+        <w:rPr>
+          <w:sz w:val="22"/>
+        </w:rPr>
+      </w:r>
+    </w:p>
+    <w:p>
+      <w:r>
+        <w:rPr>
+          <w:sz w:val="22"/>
+        </w:rPr>
+        <w:t>Key levers:</w:t>
+      </w:r>
+    </w:p>
+    <w:p>
+      <w:pPr>
+        <w:pStyle w:val="ListBullet"/>
+      </w:pPr>
+      <w:r>
+        <w:rPr>
+          <w:sz w:val="22"/>
+        </w:rPr>
+      </w:r>
+      <w:r>
+        <w:rPr>
+          <w:b/>
+          <w:sz w:val="22"/>
+        </w:rPr>
+        <w:t>US cohort size:</w:t>
+      </w:r>
+      <w:r>
+        <w:rPr>
+          <w:sz w:val="22"/>
+        </w:rPr>
+        <w:t xml:space="preserve"> 12 → 24 students as facilitator experience grows</w:t>
+      </w:r>
+    </w:p>
+    <w:p>
+      <w:pPr>
+        <w:pStyle w:val="ListBullet"/>
+      </w:pPr>
+      <w:r>
+        <w:rPr>
+          <w:sz w:val="22"/>
+        </w:rPr>
+      </w:r>
+      <w:r>
+        <w:rPr>
+          <w:b/>
+          <w:sz w:val="22"/>
+        </w:rPr>
+        <w:t>GDS cohort size:</w:t>
+      </w:r>
+      <w:r>
+        <w:rPr>
+          <w:sz w:val="22"/>
+        </w:rPr>
+        <w:t xml:space="preserve"> 36 students (lower cost, higher density)</w:t>
+      </w:r>
+    </w:p>
+    <w:p>
+      <w:pPr>
+        <w:pStyle w:val="ListBullet"/>
+      </w:pPr>
+      <w:r>
+        <w:rPr>
+          <w:sz w:val="22"/>
+        </w:rPr>
+      </w:r>
+      <w:r>
+        <w:rPr>
+          <w:b/>
+          <w:sz w:val="22"/>
+        </w:rPr>
+        <w:t>Concurrent vendors:</w:t>
+      </w:r>
+      <w:r>
+        <w:rPr>
+          <w:sz w:val="22"/>
+        </w:rPr>
+        <w:t xml:space="preserve"> By Q1 2027, running 4+ vendor tracks simultaneously</w:t>
+      </w:r>
+    </w:p>
+    <w:p>
+      <w:pPr>
+        <w:pStyle w:val="ListBullet"/>
+      </w:pPr>
+      <w:r>
+        <w:rPr>
+          <w:sz w:val="22"/>
+        </w:rPr>
+      </w:r>
+      <w:r>
+        <w:rPr>
+          <w:b/>
+          <w:sz w:val="22"/>
+        </w:rPr>
+        <w:t>Trainer compounding:</w:t>
+      </w:r>
+      <w:r>
+        <w:rPr>
+          <w:sz w:val="22"/>
+        </w:rPr>
+        <w:t xml:space="preserve"> Each cohort produces 2-3 new trainers; by Q2 2027 we produce trainers faster than we consume them</w:t>
+      </w:r>
+    </w:p>
     <w:p>
       <w:pPr>
         <w:pStyle w:val="Heading3"/>
       </w:pPr>
       <w:r>
-        <w:t>Cumulative Scale</w:t>
+        <w:t>Technology Portfolio Architecture</w:t>
       </w:r>
     </w:p>
     <w:p>
@@ -6254,7 +7111,114 @@
         <w:rPr>
           <w:sz w:val="22"/>
         </w:rPr>
-        <w:t>|-------|----------|---------|-------------|-------------|---------------------|-------------|</w:t>
+        <w:t xml:space="preserve">The program is architected for multi-vendor reuse. This is a critical strategic advantage: we are not building an Anthropic training program — we are building a </w:t>
+      </w:r>
+      <w:r>
+        <w:rPr>
+          <w:b/>
+          <w:sz w:val="22"/>
+        </w:rPr>
+        <w:t>technology enablement engine</w:t>
+      </w:r>
+      <w:r>
+        <w:rPr>
+          <w:sz w:val="22"/>
+        </w:rPr>
+        <w:t xml:space="preserve"> that works across any AI platform.</w:t>
+      </w:r>
+    </w:p>
+    <w:p>
+      <w:pPr>
+        <w:pStyle w:val="ListBullet"/>
+      </w:pPr>
+      <w:r>
+        <w:rPr>
+          <w:sz w:val="22"/>
+        </w:rPr>
+      </w:r>
+      <w:r>
+        <w:rPr>
+          <w:b/>
+          <w:sz w:val="22"/>
+        </w:rPr>
+        <w:t>Week 1 is vendor-specific</w:t>
+      </w:r>
+      <w:r>
+        <w:rPr>
+          <w:sz w:val="22"/>
+        </w:rPr>
+        <w:t xml:space="preserve"> — rebuilt per technology to cover that vendor's products, APIs, architecture patterns, and certification domains</w:t>
+      </w:r>
+    </w:p>
+    <w:p>
+      <w:pPr>
+        <w:pStyle w:val="ListBullet"/>
+      </w:pPr>
+      <w:r>
+        <w:rPr>
+          <w:sz w:val="22"/>
+        </w:rPr>
+      </w:r>
+      <w:r>
+        <w:rPr>
+          <w:b/>
+          <w:sz w:val="22"/>
+        </w:rPr>
+        <w:t>Week 2 (AI-Native Build Methodology) is vendor-agnostic</w:t>
+      </w:r>
+      <w:r>
+        <w:rPr>
+          <w:sz w:val="22"/>
+        </w:rPr>
+        <w:t xml:space="preserve"> — reusable as-is across all technologies. Specs, harnesses, collaboration patterns, testing, deployment, and communications apply regardless of the underlying AI platform</w:t>
+      </w:r>
+    </w:p>
+    <w:p>
+      <w:pPr>
+        <w:pStyle w:val="ListBullet"/>
+      </w:pPr>
+      <w:r>
+        <w:rPr>
+          <w:sz w:val="22"/>
+        </w:rPr>
+        <w:t xml:space="preserve">Each new vendor Week 1 requires approximately </w:t>
+      </w:r>
+      <w:r>
+        <w:rPr>
+          <w:b/>
+          <w:sz w:val="22"/>
+        </w:rPr>
+        <w:t>half the design effort</w:t>
+      </w:r>
+      <w:r>
+        <w:rPr>
+          <w:sz w:val="22"/>
+        </w:rPr>
+        <w:t xml:space="preserve"> of the initial Anthropic Week 1 — the pedagogical structure, lab format, and assessment framework are all reused</w:t>
+      </w:r>
+    </w:p>
+    <w:p>
+      <w:r>
+        <w:rPr>
+          <w:sz w:val="22"/>
+        </w:rPr>
+        <w:t>The train-the-trainer model compounds across technologies: a facilitator who has run the Anthropic cohort can run the OpenAI or AWS cohort with only Week 1 retraining, because the AI-Native Build Methodology skills transfer directly.</w:t>
+      </w:r>
+    </w:p>
+    <w:p>
+      <w:pPr>
+        <w:pStyle w:val="Heading3"/>
+      </w:pPr>
+      <w:r>
+        <w:t>Geographic Reach</w:t>
+      </w:r>
+    </w:p>
+    <w:p>
+      <w:r>
+        <w:rPr>
+          <w:sz w:val="22"/>
+        </w:rPr>
+        <w:t>|-----------|------------|-------------|-----------------|</w:t>
       </w:r>
     </w:p>
     <w:tbl>
@@ -6264,103 +7228,61 @@
         <w:tblLook w:firstColumn="1" w:firstRow="1" w:lastColumn="0" w:lastRow="0" w:noHBand="0" w:noVBand="1" w:val="04A0"/>
       </w:tblPr>
       <w:tblGrid>
-        <w:gridCol w:w="1234"/>
-        <w:gridCol w:w="1234"/>
-        <w:gridCol w:w="1234"/>
-        <w:gridCol w:w="1234"/>
-        <w:gridCol w:w="1234"/>
-        <w:gridCol w:w="1234"/>
-        <w:gridCol w:w="1234"/>
+        <w:gridCol w:w="2160"/>
+        <w:gridCol w:w="2160"/>
+        <w:gridCol w:w="2160"/>
+        <w:gridCol w:w="2160"/>
       </w:tblGrid>
       <w:tr>
         <w:tc>
           <w:tcPr>
-            <w:tcW w:type="dxa" w:w="1234"/>
+            <w:tcW w:type="dxa" w:w="2160"/>
           </w:tcPr>
           <w:p>
             <w:r>
               <w:rPr>
                 <w:b/>
               </w:rPr>
-              <w:t>Phase</w:t>
-            </w:r>
-          </w:p>
-        </w:tc>
-        <w:tc>
-          <w:tcPr>
-            <w:tcW w:type="dxa" w:w="1234"/>
+              <w:t>Geography</w:t>
+            </w:r>
+          </w:p>
+        </w:tc>
+        <w:tc>
+          <w:tcPr>
+            <w:tcW w:type="dxa" w:w="2160"/>
           </w:tcPr>
           <w:p>
             <w:r>
               <w:rPr>
                 <w:b/>
               </w:rPr>
-              <w:t>Timeline</w:t>
-            </w:r>
-          </w:p>
-        </w:tc>
-        <w:tc>
-          <w:tcPr>
-            <w:tcW w:type="dxa" w:w="1234"/>
+              <w:t>Cohort Size</w:t>
+            </w:r>
+          </w:p>
+        </w:tc>
+        <w:tc>
+          <w:tcPr>
+            <w:tcW w:type="dxa" w:w="2160"/>
           </w:tcPr>
           <w:p>
             <w:r>
               <w:rPr>
                 <w:b/>
               </w:rPr>
-              <w:t>Cohorts</w:t>
-            </w:r>
-          </w:p>
-        </w:tc>
-        <w:tc>
-          <w:tcPr>
-            <w:tcW w:type="dxa" w:w="1234"/>
+              <w:t>Cost/Student</w:t>
+            </w:r>
+          </w:p>
+        </w:tc>
+        <w:tc>
+          <w:tcPr>
+            <w:tcW w:type="dxa" w:w="2160"/>
           </w:tcPr>
           <w:p>
             <w:r>
               <w:rPr>
                 <w:b/>
               </w:rPr>
-              <w:t>Technologies</w:t>
-            </w:r>
-          </w:p>
-        </w:tc>
-        <w:tc>
-          <w:tcPr>
-            <w:tcW w:type="dxa" w:w="1234"/>
-          </w:tcPr>
-          <w:p>
-            <w:r>
-              <w:rPr>
-                <w:b/>
-              </w:rPr>
-              <w:t>Geographies</w:t>
-            </w:r>
-          </w:p>
-        </w:tc>
-        <w:tc>
-          <w:tcPr>
-            <w:tcW w:type="dxa" w:w="1234"/>
-          </w:tcPr>
-          <w:p>
-            <w:r>
-              <w:rPr>
-                <w:b/>
-              </w:rPr>
-              <w:t>Certification-Ready Practitioners</w:t>
-            </w:r>
-          </w:p>
-        </w:tc>
-        <w:tc>
-          <w:tcPr>
-            <w:tcW w:type="dxa" w:w="1234"/>
-          </w:tcPr>
-          <w:p>
-            <w:r>
-              <w:rPr>
-                <w:b/>
-              </w:rPr>
-              <w:t>Facilitators</w:t>
+              <w:t>Strategic Value</w:t>
             </w:r>
           </w:p>
         </w:tc>
@@ -6368,71 +7290,41 @@
       <w:tr>
         <w:tc>
           <w:tcPr>
-            <w:tcW w:type="dxa" w:w="1234"/>
-          </w:tcPr>
-          <w:p>
-            <w:r>
-              <w:t>Phase 1</w:t>
-            </w:r>
-          </w:p>
-        </w:tc>
-        <w:tc>
-          <w:tcPr>
-            <w:tcW w:type="dxa" w:w="1234"/>
-          </w:tcPr>
-          <w:p>
-            <w:r>
-              <w:t>Q3 2026</w:t>
-            </w:r>
-          </w:p>
-        </w:tc>
-        <w:tc>
-          <w:tcPr>
-            <w:tcW w:type="dxa" w:w="1234"/>
-          </w:tcPr>
-          <w:p>
-            <w:r>
-              <w:t>1</w:t>
-            </w:r>
-          </w:p>
-        </w:tc>
-        <w:tc>
-          <w:tcPr>
-            <w:tcW w:type="dxa" w:w="1234"/>
-          </w:tcPr>
-          <w:p>
-            <w:r>
-              <w:t>1 (Anthropic)</w:t>
-            </w:r>
-          </w:p>
-        </w:tc>
-        <w:tc>
-          <w:tcPr>
-            <w:tcW w:type="dxa" w:w="1234"/>
-          </w:tcPr>
-          <w:p>
-            <w:r>
-              <w:t>1 (US)</w:t>
-            </w:r>
-          </w:p>
-        </w:tc>
-        <w:tc>
-          <w:tcPr>
-            <w:tcW w:type="dxa" w:w="1234"/>
-          </w:tcPr>
-          <w:p>
-            <w:r>
-              <w:t>12</w:t>
-            </w:r>
-          </w:p>
-        </w:tc>
-        <w:tc>
-          <w:tcPr>
-            <w:tcW w:type="dxa" w:w="1234"/>
-          </w:tcPr>
-          <w:p>
-            <w:r>
-              <w:t>3 (program team)</w:t>
+            <w:tcW w:type="dxa" w:w="2160"/>
+          </w:tcPr>
+          <w:p>
+            <w:r>
+              <w:t>**US (multi-city)**</w:t>
+            </w:r>
+          </w:p>
+        </w:tc>
+        <w:tc>
+          <w:tcPr>
+            <w:tcW w:type="dxa" w:w="2160"/>
+          </w:tcPr>
+          <w:p>
+            <w:r>
+              <w:t>12 → 24</w:t>
+            </w:r>
+          </w:p>
+        </w:tc>
+        <w:tc>
+          <w:tcPr>
+            <w:tcW w:type="dxa" w:w="2160"/>
+          </w:tcPr>
+          <w:p>
+            <w:r>
+              <w:t>~$12,000-24,000</w:t>
+            </w:r>
+          </w:p>
+        </w:tc>
+        <w:tc>
+          <w:tcPr>
+            <w:tcW w:type="dxa" w:w="2160"/>
+          </w:tcPr>
+          <w:p>
+            <w:r>
+              <w:t>Client-facing delivery bench, trainer pipeline</w:t>
             </w:r>
           </w:p>
         </w:tc>
@@ -6440,71 +7332,41 @@
       <w:tr>
         <w:tc>
           <w:tcPr>
-            <w:tcW w:type="dxa" w:w="1234"/>
-          </w:tcPr>
-          <w:p>
-            <w:r>
-              <w:t>Phase 2</w:t>
-            </w:r>
-          </w:p>
-        </w:tc>
-        <w:tc>
-          <w:tcPr>
-            <w:tcW w:type="dxa" w:w="1234"/>
-          </w:tcPr>
-          <w:p>
-            <w:r>
-              <w:t>Q4 2026</w:t>
-            </w:r>
-          </w:p>
-        </w:tc>
-        <w:tc>
-          <w:tcPr>
-            <w:tcW w:type="dxa" w:w="1234"/>
-          </w:tcPr>
-          <w:p>
-            <w:r>
-              <w:t>3</w:t>
-            </w:r>
-          </w:p>
-        </w:tc>
-        <w:tc>
-          <w:tcPr>
-            <w:tcW w:type="dxa" w:w="1234"/>
-          </w:tcPr>
-          <w:p>
-            <w:r>
-              <w:t>1 (Anthropic)</w:t>
-            </w:r>
-          </w:p>
-        </w:tc>
-        <w:tc>
-          <w:tcPr>
-            <w:tcW w:type="dxa" w:w="1234"/>
-          </w:tcPr>
-          <w:p>
-            <w:r>
-              <w:t>2 (US, India)</w:t>
-            </w:r>
-          </w:p>
-        </w:tc>
-        <w:tc>
-          <w:tcPr>
-            <w:tcW w:type="dxa" w:w="1234"/>
-          </w:tcPr>
-          <w:p>
-            <w:r>
-              <w:t>48</w:t>
-            </w:r>
-          </w:p>
-        </w:tc>
-        <w:tc>
-          <w:tcPr>
-            <w:tcW w:type="dxa" w:w="1234"/>
-          </w:tcPr>
-          <w:p>
-            <w:r>
-              <w:t>5-6 (Phase 1 grads)</w:t>
+            <w:tcW w:type="dxa" w:w="2160"/>
+          </w:tcPr>
+          <w:p>
+            <w:r>
+              <w:t>**GDS India** (Bangalore, Hyderabad)</w:t>
+            </w:r>
+          </w:p>
+        </w:tc>
+        <w:tc>
+          <w:tcPr>
+            <w:tcW w:type="dxa" w:w="2160"/>
+          </w:tcPr>
+          <w:p>
+            <w:r>
+              <w:t>36</w:t>
+            </w:r>
+          </w:p>
+        </w:tc>
+        <w:tc>
+          <w:tcPr>
+            <w:tcW w:type="dxa" w:w="2160"/>
+          </w:tcPr>
+          <w:p>
+            <w:r>
+              <w:t>~$5,000-7,500</w:t>
+            </w:r>
+          </w:p>
+        </w:tc>
+        <w:tc>
+          <w:tcPr>
+            <w:tcW w:type="dxa" w:w="2160"/>
+          </w:tcPr>
+          <w:p>
+            <w:r>
+              <w:t>Cost-efficient scale, 24/7 delivery capability</w:t>
             </w:r>
           </w:p>
         </w:tc>
@@ -6512,143 +7374,41 @@
       <w:tr>
         <w:tc>
           <w:tcPr>
-            <w:tcW w:type="dxa" w:w="1234"/>
-          </w:tcPr>
-          <w:p>
-            <w:r>
-              <w:t>Phase 3</w:t>
-            </w:r>
-          </w:p>
-        </w:tc>
-        <w:tc>
-          <w:tcPr>
-            <w:tcW w:type="dxa" w:w="1234"/>
-          </w:tcPr>
-          <w:p>
-            <w:r>
-              <w:t>Q1-Q2 2027</w:t>
-            </w:r>
-          </w:p>
-        </w:tc>
-        <w:tc>
-          <w:tcPr>
-            <w:tcW w:type="dxa" w:w="1234"/>
-          </w:tcPr>
-          <w:p>
-            <w:r>
-              <w:t>7+</w:t>
-            </w:r>
-          </w:p>
-        </w:tc>
-        <w:tc>
-          <w:tcPr>
-            <w:tcW w:type="dxa" w:w="1234"/>
-          </w:tcPr>
-          <w:p>
-            <w:r>
-              <w:t>4 (+ NVIDIA, AWS, GCP)</w:t>
-            </w:r>
-          </w:p>
-        </w:tc>
-        <w:tc>
-          <w:tcPr>
-            <w:tcW w:type="dxa" w:w="1234"/>
-          </w:tcPr>
-          <w:p>
-            <w:r>
-              <w:t>3 (+ Mexico)</w:t>
-            </w:r>
-          </w:p>
-        </w:tc>
-        <w:tc>
-          <w:tcPr>
-            <w:tcW w:type="dxa" w:w="1234"/>
-          </w:tcPr>
-          <w:p>
-            <w:r>
-              <w:t>96+</w:t>
-            </w:r>
-          </w:p>
-        </w:tc>
-        <w:tc>
-          <w:tcPr>
-            <w:tcW w:type="dxa" w:w="1234"/>
-          </w:tcPr>
-          <w:p>
-            <w:r>
-              <w:t>10+ (Phase 1-2 grads)</w:t>
-            </w:r>
-          </w:p>
-        </w:tc>
-      </w:tr>
-      <w:tr>
-        <w:tc>
-          <w:tcPr>
-            <w:tcW w:type="dxa" w:w="1234"/>
-          </w:tcPr>
-          <w:p>
-            <w:r>
-              <w:t>Phase 4</w:t>
-            </w:r>
-          </w:p>
-        </w:tc>
-        <w:tc>
-          <w:tcPr>
-            <w:tcW w:type="dxa" w:w="1234"/>
-          </w:tcPr>
-          <w:p>
-            <w:r>
-              <w:t>Q3 2027+</w:t>
-            </w:r>
-          </w:p>
-        </w:tc>
-        <w:tc>
-          <w:tcPr>
-            <w:tcW w:type="dxa" w:w="1234"/>
-          </w:tcPr>
-          <w:p>
-            <w:r>
-              <w:t>12+</w:t>
-            </w:r>
-          </w:p>
-        </w:tc>
-        <w:tc>
-          <w:tcPr>
-            <w:tcW w:type="dxa" w:w="1234"/>
-          </w:tcPr>
-          <w:p>
-            <w:r>
-              <w:t>8+ (+ OpenAI, IBM, Palantir, Databricks)</w:t>
-            </w:r>
-          </w:p>
-        </w:tc>
-        <w:tc>
-          <w:tcPr>
-            <w:tcW w:type="dxa" w:w="1234"/>
-          </w:tcPr>
-          <w:p>
-            <w:r>
-              <w:t>3+</w:t>
-            </w:r>
-          </w:p>
-        </w:tc>
-        <w:tc>
-          <w:tcPr>
-            <w:tcW w:type="dxa" w:w="1234"/>
-          </w:tcPr>
-          <w:p>
-            <w:r>
-              <w:t>200+</w:t>
-            </w:r>
-          </w:p>
-        </w:tc>
-        <w:tc>
-          <w:tcPr>
-            <w:tcW w:type="dxa" w:w="1234"/>
-          </w:tcPr>
-          <w:p>
-            <w:r>
-              <w:t>Self-sustaining pool</w:t>
+            <w:tcW w:type="dxa" w:w="2160"/>
+          </w:tcPr>
+          <w:p>
+            <w:r>
+              <w:t>**GDS Mexico** (Mexico City, Guadalajara)</w:t>
+            </w:r>
+          </w:p>
+        </w:tc>
+        <w:tc>
+          <w:tcPr>
+            <w:tcW w:type="dxa" w:w="2160"/>
+          </w:tcPr>
+          <w:p>
+            <w:r>
+              <w:t>36</w:t>
+            </w:r>
+          </w:p>
+        </w:tc>
+        <w:tc>
+          <w:tcPr>
+            <w:tcW w:type="dxa" w:w="2160"/>
+          </w:tcPr>
+          <w:p>
+            <w:r>
+              <w:t>~$4,000-6,000</w:t>
+            </w:r>
+          </w:p>
+        </w:tc>
+        <w:tc>
+          <w:tcPr>
+            <w:tcW w:type="dxa" w:w="2160"/>
+          </w:tcPr>
+          <w:p>
+            <w:r>
+              <w:t>Nearshore bench, US time zone alignment</w:t>
             </w:r>
           </w:p>
         </w:tc>

</xml_diff>